<commit_message>
Recuperar tabla de contenido en documento
</commit_message>
<xml_diff>
--- a/Claselovin/documentacion/Primera entrega.docx
+++ b/Claselovin/documentacion/Primera entrega.docx
@@ -1,6 +1,6 @@
 
 <file path=word/document.xml><?xml version="1.0" encoding="utf-8"?>
-<w:document xmlns:wpc="http://schemas.microsoft.com/office/word/2010/wordprocessingCanvas" xmlns:cx="http://schemas.microsoft.com/office/drawing/2014/chartex" xmlns:cx1="http://schemas.microsoft.com/office/drawing/2015/9/8/chartex" xmlns:cx2="http://schemas.microsoft.com/office/drawing/2015/10/21/chartex" xmlns:cx3="http://schemas.microsoft.com/office/drawing/2016/5/9/chartex" xmlns:cx4="http://schemas.microsoft.com/office/drawing/2016/5/10/chartex" xmlns:cx5="http://schemas.microsoft.com/office/drawing/2016/5/11/chartex" xmlns:cx6="http://schemas.microsoft.com/office/drawing/2016/5/12/chartex" xmlns:cx7="http://schemas.microsoft.com/office/drawing/2016/5/13/chartex" xmlns:cx8="http://schemas.microsoft.com/office/drawing/2016/5/14/chartex" xmlns:mc="http://schemas.openxmlformats.org/markup-compatibility/2006" xmlns:aink="http://schemas.microsoft.com/office/drawing/2016/ink" xmlns:am3d="http://schemas.microsoft.com/office/drawing/2017/model3d" xmlns:o="urn:schemas-microsoft-com:office:office" xmlns:oel="http://schemas.microsoft.com/office/2019/extlst" xmlns:r="http://schemas.openxmlformats.org/officeDocument/2006/relationships" xmlns:m="http://schemas.openxmlformats.org/officeDocument/2006/math" xmlns:v="urn:schemas-microsoft-com:vml" xmlns:wp14="http://schemas.microsoft.com/office/word/2010/wordprocessingDrawing" xmlns:wp="http://schemas.openxmlformats.org/drawingml/2006/wordprocessingDrawing" xmlns:w10="urn:schemas-microsoft-com:office:word" xmlns:w="http://schemas.openxmlformats.org/wordprocessingml/2006/main" xmlns:w14="http://schemas.microsoft.com/office/word/2010/wordml" xmlns:w15="http://schemas.microsoft.com/office/word/2012/wordml" xmlns:w16cex="http://schemas.microsoft.com/office/word/2018/wordml/cex" xmlns:w16cid="http://schemas.microsoft.com/office/word/2016/wordml/cid" xmlns:w16="http://schemas.microsoft.com/office/word/2018/wordml" xmlns:w16sdtdh="http://schemas.microsoft.com/office/word/2020/wordml/sdtdatahash" xmlns:w16se="http://schemas.microsoft.com/office/word/2015/wordml/symex" xmlns:wpg="http://schemas.microsoft.com/office/word/2010/wordprocessingGroup" xmlns:wpi="http://schemas.microsoft.com/office/word/2010/wordprocessingInk" xmlns:wne="http://schemas.microsoft.com/office/word/2006/wordml" xmlns:wps="http://schemas.microsoft.com/office/word/2010/wordprocessingShape" mc:Ignorable="w14 w15 w16se w16cid w16 w16cex w16sdtdh wp14">
+<w:document xmlns:wpc="http://schemas.microsoft.com/office/word/2010/wordprocessingCanvas" xmlns:cx="http://schemas.microsoft.com/office/drawing/2014/chartex" xmlns:cx1="http://schemas.microsoft.com/office/drawing/2015/9/8/chartex" xmlns:cx2="http://schemas.microsoft.com/office/drawing/2015/10/21/chartex" xmlns:cx3="http://schemas.microsoft.com/office/drawing/2016/5/9/chartex" xmlns:cx4="http://schemas.microsoft.com/office/drawing/2016/5/10/chartex" xmlns:cx5="http://schemas.microsoft.com/office/drawing/2016/5/11/chartex" xmlns:cx6="http://schemas.microsoft.com/office/drawing/2016/5/12/chartex" xmlns:cx7="http://schemas.microsoft.com/office/drawing/2016/5/13/chartex" xmlns:cx8="http://schemas.microsoft.com/office/drawing/2016/5/14/chartex" xmlns:mc="http://schemas.openxmlformats.org/markup-compatibility/2006" xmlns:aink="http://schemas.microsoft.com/office/drawing/2016/ink" xmlns:am3d="http://schemas.microsoft.com/office/drawing/2017/model3d" xmlns:o="urn:schemas-microsoft-com:office:office" xmlns:oel="http://schemas.microsoft.com/office/2019/extlst" xmlns:r="http://schemas.openxmlformats.org/officeDocument/2006/relationships" xmlns:m="http://schemas.openxmlformats.org/officeDocument/2006/math" xmlns:v="urn:schemas-microsoft-com:vml" xmlns:wp14="http://schemas.microsoft.com/office/word/2010/wordprocessingDrawing" xmlns:wp="http://schemas.openxmlformats.org/drawingml/2006/wordprocessingDrawing" xmlns:w10="urn:schemas-microsoft-com:office:word" xmlns:w="http://schemas.openxmlformats.org/wordprocessingml/2006/main" xmlns:w14="http://schemas.microsoft.com/office/word/2010/wordml" xmlns:w15="http://schemas.microsoft.com/office/word/2012/wordml" xmlns:w16cex="http://schemas.microsoft.com/office/word/2018/wordml/cex" xmlns:w16cid="http://schemas.microsoft.com/office/word/2016/wordml/cid" xmlns:w16="http://schemas.microsoft.com/office/word/2018/wordml" xmlns:w16du="http://schemas.microsoft.com/office/word/2023/wordml/word16du" xmlns:w16sdtdh="http://schemas.microsoft.com/office/word/2020/wordml/sdtdatahash" xmlns:w16sdtfl="http://schemas.microsoft.com/office/word/2024/wordml/sdtformatlock" xmlns:w16se="http://schemas.microsoft.com/office/word/2015/wordml/symex" xmlns:wpg="http://schemas.microsoft.com/office/word/2010/wordprocessingGroup" xmlns:wpi="http://schemas.microsoft.com/office/word/2010/wordprocessingInk" xmlns:wne="http://schemas.microsoft.com/office/word/2006/wordml" xmlns:wps="http://schemas.microsoft.com/office/word/2010/wordprocessingShape" mc:Ignorable="w14 w15 w16se w16cid w16 w16cex w16sdtdh w16sdtfl w16du wp14">
   <w:body>
     <w:p>
       <w:pPr>
@@ -8,6 +8,7 @@
         <w:rPr>
           <w:b/>
           <w:bCs/>
+          <w:color w:val="000000" w:themeColor="text1"/>
           <w:sz w:val="24"/>
           <w:szCs w:val="24"/>
         </w:rPr>
@@ -15,6 +16,7 @@
       <w:r>
         <w:rPr>
           <w:noProof/>
+          <w:color w:val="000000" w:themeColor="text1"/>
         </w:rPr>
         <w:drawing>
           <wp:anchor distT="0" distB="0" distL="114300" distR="114300" simplePos="0" relativeHeight="251658240" behindDoc="0" locked="0" layoutInCell="1" allowOverlap="1" wp14:anchorId="431D4DF1" wp14:editId="1BD90196">
@@ -40,7 +42,7 @@
                     <pic:cNvPicPr/>
                   </pic:nvPicPr>
                   <pic:blipFill>
-                    <a:blip r:embed="rId5" cstate="print">
+                    <a:blip r:embed="rId8" cstate="print">
                       <a:extLst>
                         <a:ext uri="{28A0092B-C50C-407E-A947-70E740481C1C}">
                           <a14:useLocalDpi xmlns:a14="http://schemas.microsoft.com/office/drawing/2010/main" val="0"/>
@@ -76,6 +78,7 @@
         <w:rPr>
           <w:b/>
           <w:bCs/>
+          <w:color w:val="000000" w:themeColor="text1"/>
           <w:sz w:val="24"/>
           <w:szCs w:val="24"/>
         </w:rPr>
@@ -88,6 +91,7 @@
         <w:rPr>
           <w:b/>
           <w:bCs/>
+          <w:color w:val="000000" w:themeColor="text1"/>
           <w:sz w:val="24"/>
           <w:szCs w:val="24"/>
         </w:rPr>
@@ -99,6 +103,7 @@
         <w:rPr>
           <w:b/>
           <w:bCs/>
+          <w:color w:val="000000" w:themeColor="text1"/>
           <w:sz w:val="24"/>
           <w:szCs w:val="24"/>
         </w:rPr>
@@ -110,6 +115,7 @@
         <w:rPr>
           <w:b/>
           <w:bCs/>
+          <w:color w:val="000000" w:themeColor="text1"/>
           <w:sz w:val="24"/>
           <w:szCs w:val="24"/>
         </w:rPr>
@@ -121,6 +127,7 @@
         <w:rPr>
           <w:b/>
           <w:bCs/>
+          <w:color w:val="000000" w:themeColor="text1"/>
           <w:sz w:val="24"/>
           <w:szCs w:val="24"/>
         </w:rPr>
@@ -132,18 +139,26 @@
         <w:rPr>
           <w:b/>
           <w:bCs/>
-          <w:sz w:val="24"/>
-          <w:szCs w:val="24"/>
-        </w:rPr>
-      </w:pPr>
-    </w:p>
-    <w:p/>
+          <w:color w:val="000000" w:themeColor="text1"/>
+          <w:sz w:val="24"/>
+          <w:szCs w:val="24"/>
+        </w:rPr>
+      </w:pPr>
+    </w:p>
+    <w:p>
+      <w:pPr>
+        <w:rPr>
+          <w:color w:val="000000" w:themeColor="text1"/>
+        </w:rPr>
+      </w:pPr>
+    </w:p>
     <w:p>
       <w:pPr>
         <w:jc w:val="center"/>
         <w:rPr>
           <w:b/>
           <w:bCs/>
+          <w:color w:val="000000" w:themeColor="text1"/>
           <w:sz w:val="24"/>
           <w:szCs w:val="24"/>
         </w:rPr>
@@ -152,55 +167,62 @@
         <w:rPr>
           <w:b/>
           <w:bCs/>
-          <w:sz w:val="24"/>
-          <w:szCs w:val="24"/>
-        </w:rPr>
-        <w:t>GESTION DE PROYECTO</w:t>
-      </w:r>
-      <w:r>
+          <w:color w:val="000000" w:themeColor="text1"/>
+          <w:sz w:val="24"/>
+          <w:szCs w:val="24"/>
+        </w:rPr>
+        <w:t>GESTION DE PROYECTO DE SOFTWARE</w:t>
+      </w:r>
+    </w:p>
+    <w:p>
+      <w:pPr>
+        <w:jc w:val="center"/>
+        <w:rPr>
+          <w:color w:val="000000" w:themeColor="text1"/>
+        </w:rPr>
+      </w:pPr>
+    </w:p>
+    <w:p>
+      <w:pPr>
+        <w:rPr>
+          <w:color w:val="000000" w:themeColor="text1"/>
+        </w:rPr>
+      </w:pPr>
+    </w:p>
+    <w:p>
+      <w:pPr>
+        <w:rPr>
+          <w:color w:val="000000" w:themeColor="text1"/>
+        </w:rPr>
+      </w:pPr>
+    </w:p>
+    <w:p>
+      <w:pPr>
+        <w:rPr>
+          <w:color w:val="000000" w:themeColor="text1"/>
+        </w:rPr>
+      </w:pPr>
+    </w:p>
+    <w:p>
+      <w:pPr>
+        <w:jc w:val="center"/>
         <w:rPr>
           <w:b/>
           <w:bCs/>
-          <w:sz w:val="24"/>
-          <w:szCs w:val="24"/>
-        </w:rPr>
-        <w:t xml:space="preserve"> DE SOFTWARE</w:t>
-      </w:r>
-    </w:p>
-    <w:p>
-      <w:pPr>
-        <w:jc w:val="center"/>
-      </w:pPr>
-    </w:p>
-    <w:p/>
-    <w:p/>
-    <w:p/>
-    <w:p>
-      <w:pPr>
+          <w:color w:val="000000" w:themeColor="text1"/>
+          <w:sz w:val="24"/>
+          <w:szCs w:val="24"/>
+        </w:rPr>
+      </w:pPr>
+      <w:r>
         <w:rPr>
           <w:b/>
           <w:bCs/>
-          <w:sz w:val="24"/>
-          <w:szCs w:val="24"/>
-        </w:rPr>
-      </w:pPr>
-      <w:r>
-        <w:rPr>
-          <w:b/>
-          <w:bCs/>
+          <w:color w:val="000000" w:themeColor="text1"/>
           <w:sz w:val="24"/>
           <w:szCs w:val="24"/>
         </w:rPr>
         <w:t>Integrantes:</w:t>
-      </w:r>
-      <w:r>
-        <w:rPr>
-          <w:b/>
-          <w:bCs/>
-          <w:sz w:val="24"/>
-          <w:szCs w:val="24"/>
-        </w:rPr>
-        <w:t xml:space="preserve"> </w:t>
       </w:r>
     </w:p>
     <w:p>
@@ -208,15 +230,18 @@
         <w:pStyle w:val="Prrafodelista"/>
         <w:numPr>
           <w:ilvl w:val="0"/>
-          <w:numId w:val="4"/>
+          <w:numId w:val="5"/>
         </w:numPr>
-        <w:rPr>
-          <w:sz w:val="24"/>
-          <w:szCs w:val="24"/>
-        </w:rPr>
-      </w:pPr>
-      <w:r>
-        <w:rPr>
+        <w:jc w:val="center"/>
+        <w:rPr>
+          <w:color w:val="000000" w:themeColor="text1"/>
+          <w:sz w:val="24"/>
+          <w:szCs w:val="24"/>
+        </w:rPr>
+      </w:pPr>
+      <w:r>
+        <w:rPr>
+          <w:color w:val="000000" w:themeColor="text1"/>
           <w:sz w:val="24"/>
           <w:szCs w:val="24"/>
         </w:rPr>
@@ -228,27 +253,39 @@
         <w:pStyle w:val="Prrafodelista"/>
         <w:numPr>
           <w:ilvl w:val="0"/>
-          <w:numId w:val="4"/>
+          <w:numId w:val="5"/>
         </w:numPr>
-        <w:rPr>
-          <w:sz w:val="24"/>
-          <w:szCs w:val="24"/>
-        </w:rPr>
-      </w:pPr>
-      <w:r>
-        <w:rPr>
+        <w:jc w:val="center"/>
+        <w:rPr>
+          <w:color w:val="000000" w:themeColor="text1"/>
+          <w:sz w:val="24"/>
+          <w:szCs w:val="24"/>
+        </w:rPr>
+      </w:pPr>
+      <w:r>
+        <w:rPr>
+          <w:color w:val="000000" w:themeColor="text1"/>
           <w:sz w:val="24"/>
           <w:szCs w:val="24"/>
         </w:rPr>
         <w:t>Yeris Manuel López Flores.</w:t>
       </w:r>
     </w:p>
-    <w:p/>
-    <w:p>
-      <w:pPr>
+    <w:p>
+      <w:pPr>
+        <w:jc w:val="center"/>
+        <w:rPr>
+          <w:color w:val="000000" w:themeColor="text1"/>
+        </w:rPr>
+      </w:pPr>
+    </w:p>
+    <w:p>
+      <w:pPr>
+        <w:jc w:val="center"/>
         <w:rPr>
           <w:b/>
           <w:bCs/>
+          <w:color w:val="000000" w:themeColor="text1"/>
           <w:sz w:val="24"/>
           <w:szCs w:val="24"/>
         </w:rPr>
@@ -257,6 +294,7 @@
         <w:rPr>
           <w:b/>
           <w:bCs/>
+          <w:color w:val="000000" w:themeColor="text1"/>
           <w:sz w:val="24"/>
           <w:szCs w:val="24"/>
         </w:rPr>
@@ -266,6 +304,7 @@
         <w:rPr>
           <w:b/>
           <w:bCs/>
+          <w:color w:val="000000" w:themeColor="text1"/>
           <w:sz w:val="24"/>
           <w:szCs w:val="24"/>
         </w:rPr>
@@ -273,18 +312,33 @@
       </w:r>
       <w:r>
         <w:rPr>
+          <w:color w:val="000000" w:themeColor="text1"/>
           <w:sz w:val="24"/>
           <w:szCs w:val="24"/>
         </w:rPr>
         <w:t>David Lovo</w:t>
       </w:r>
     </w:p>
-    <w:p/>
-    <w:p>
+    <w:p>
+      <w:pPr>
+        <w:jc w:val="center"/>
+        <w:rPr>
+          <w:color w:val="000000" w:themeColor="text1"/>
+        </w:rPr>
+      </w:pPr>
+    </w:p>
+    <w:p>
+      <w:pPr>
+        <w:jc w:val="center"/>
+        <w:rPr>
+          <w:color w:val="000000" w:themeColor="text1"/>
+        </w:rPr>
+      </w:pPr>
       <w:r>
         <w:rPr>
           <w:b/>
           <w:bCs/>
+          <w:color w:val="000000" w:themeColor="text1"/>
         </w:rPr>
         <w:t>Grupo:</w:t>
       </w:r>
@@ -292,76 +346,973 @@
         <w:rPr>
           <w:b/>
           <w:bCs/>
+          <w:color w:val="000000" w:themeColor="text1"/>
         </w:rPr>
         <w:t xml:space="preserve"> </w:t>
       </w:r>
       <w:r>
+        <w:rPr>
+          <w:color w:val="000000" w:themeColor="text1"/>
+        </w:rPr>
         <w:t>DI14C</w:t>
       </w:r>
     </w:p>
-    <w:p/>
-    <w:p>
-      <w:pPr>
+    <w:p>
+      <w:pPr>
+        <w:jc w:val="center"/>
+        <w:rPr>
+          <w:color w:val="000000" w:themeColor="text1"/>
+        </w:rPr>
+      </w:pPr>
+    </w:p>
+    <w:p>
+      <w:pPr>
+        <w:jc w:val="center"/>
         <w:rPr>
           <w:b/>
           <w:bCs/>
+          <w:color w:val="000000" w:themeColor="text1"/>
         </w:rPr>
       </w:pPr>
       <w:r>
         <w:rPr>
           <w:b/>
           <w:bCs/>
+          <w:color w:val="000000" w:themeColor="text1"/>
         </w:rPr>
         <w:t>Laboratorio:</w:t>
       </w:r>
       <w:r>
+        <w:rPr>
+          <w:color w:val="000000" w:themeColor="text1"/>
+        </w:rPr>
         <w:t xml:space="preserve"> L01</w:t>
       </w:r>
     </w:p>
     <w:p>
-      <w:r>
+      <w:pPr>
+        <w:jc w:val="center"/>
+        <w:rPr>
+          <w:color w:val="000000" w:themeColor="text1"/>
+        </w:rPr>
+      </w:pPr>
+      <w:r>
+        <w:rPr>
+          <w:color w:val="000000" w:themeColor="text1"/>
+        </w:rPr>
         <w:br w:type="page"/>
       </w:r>
     </w:p>
-    <w:p/>
-    <w:p>
-      <w:r>
-        <w:br w:type="page"/>
-      </w:r>
-    </w:p>
-    <w:p>
-      <w:pPr>
-        <w:rPr>
-          <w:rFonts w:ascii="Times New Roman" w:hAnsi="Times New Roman" w:cs="Times New Roman"/>
+    <w:p>
+      <w:pPr>
+        <w:pStyle w:val="TtuloTDC"/>
+        <w:rPr>
+          <w:color w:val="000000" w:themeColor="text1"/>
+        </w:rPr>
+      </w:pPr>
+    </w:p>
+    <w:sdt>
+      <w:sdtPr>
+        <w:rPr>
+          <w:color w:val="000000" w:themeColor="text1"/>
+          <w:lang w:val="es-MX"/>
+        </w:rPr>
+        <w:id w:val="-561025148"/>
+        <w:docPartObj>
+          <w:docPartGallery w:val="Table of Contents"/>
+          <w:docPartUnique/>
+        </w:docPartObj>
+      </w:sdtPr>
+      <w:sdtEndPr>
+        <w:rPr>
+          <w:rFonts w:asciiTheme="minorHAnsi" w:eastAsiaTheme="minorHAnsi" w:hAnsiTheme="minorHAnsi" w:cstheme="minorBidi"/>
           <w:b/>
           <w:bCs/>
-          <w:sz w:val="24"/>
-          <w:szCs w:val="24"/>
-        </w:rPr>
-      </w:pPr>
-      <w:r>
+          <w:kern w:val="2"/>
+          <w:sz w:val="22"/>
+          <w:szCs w:val="22"/>
+          <w:lang w:eastAsia="en-US"/>
+          <w14:ligatures w14:val="standardContextual"/>
+        </w:rPr>
+      </w:sdtEndPr>
+      <w:sdtContent>
+        <w:p>
+          <w:pPr>
+            <w:pStyle w:val="TtuloTDC"/>
+            <w:rPr>
+              <w:color w:val="000000" w:themeColor="text1"/>
+            </w:rPr>
+          </w:pPr>
+          <w:r>
+            <w:rPr>
+              <w:color w:val="000000" w:themeColor="text1"/>
+              <w:lang w:val="es-MX"/>
+            </w:rPr>
+            <w:t>Contenido</w:t>
+          </w:r>
+        </w:p>
+        <w:p>
+          <w:pPr>
+            <w:pStyle w:val="TDC1"/>
+            <w:tabs>
+              <w:tab w:val="right" w:leader="dot" w:pos="9350"/>
+            </w:tabs>
+            <w:rPr>
+              <w:rFonts w:eastAsiaTheme="minorEastAsia"/>
+              <w:noProof/>
+              <w:color w:val="000000" w:themeColor="text1"/>
+              <w:sz w:val="24"/>
+              <w:szCs w:val="24"/>
+              <w:lang w:val="es-ES" w:eastAsia="es-ES"/>
+            </w:rPr>
+          </w:pPr>
+          <w:r>
+            <w:rPr>
+              <w:color w:val="000000" w:themeColor="text1"/>
+            </w:rPr>
+            <w:fldChar w:fldCharType="begin"/>
+          </w:r>
+          <w:r>
+            <w:rPr>
+              <w:color w:val="000000" w:themeColor="text1"/>
+            </w:rPr>
+            <w:instrText xml:space="preserve"> TOC \o "1-3" \h \z \u </w:instrText>
+          </w:r>
+          <w:r>
+            <w:rPr>
+              <w:color w:val="000000" w:themeColor="text1"/>
+            </w:rPr>
+            <w:fldChar w:fldCharType="separate"/>
+          </w:r>
+          <w:hyperlink w:anchor="_Toc231651122" w:history="1">
+            <w:r>
+              <w:rPr>
+                <w:rStyle w:val="Hipervnculo"/>
+                <w:noProof/>
+                <w:color w:val="000000" w:themeColor="text1"/>
+              </w:rPr>
+              <w:t>Antecedentes</w:t>
+            </w:r>
+            <w:r>
+              <w:rPr>
+                <w:noProof/>
+                <w:webHidden/>
+                <w:color w:val="000000" w:themeColor="text1"/>
+              </w:rPr>
+              <w:tab/>
+            </w:r>
+            <w:r>
+              <w:rPr>
+                <w:noProof/>
+                <w:webHidden/>
+                <w:color w:val="000000" w:themeColor="text1"/>
+              </w:rPr>
+              <w:fldChar w:fldCharType="begin"/>
+            </w:r>
+            <w:r>
+              <w:rPr>
+                <w:noProof/>
+                <w:webHidden/>
+                <w:color w:val="000000" w:themeColor="text1"/>
+              </w:rPr>
+              <w:instrText xml:space="preserve"> PAGEREF _Toc231651122 \h </w:instrText>
+            </w:r>
+            <w:r>
+              <w:rPr>
+                <w:noProof/>
+                <w:webHidden/>
+                <w:color w:val="000000" w:themeColor="text1"/>
+              </w:rPr>
+            </w:r>
+            <w:r>
+              <w:rPr>
+                <w:noProof/>
+                <w:webHidden/>
+                <w:color w:val="000000" w:themeColor="text1"/>
+              </w:rPr>
+              <w:fldChar w:fldCharType="separate"/>
+            </w:r>
+            <w:r>
+              <w:rPr>
+                <w:noProof/>
+                <w:webHidden/>
+                <w:color w:val="000000" w:themeColor="text1"/>
+              </w:rPr>
+              <w:t>3</w:t>
+            </w:r>
+            <w:r>
+              <w:rPr>
+                <w:noProof/>
+                <w:webHidden/>
+                <w:color w:val="000000" w:themeColor="text1"/>
+              </w:rPr>
+              <w:fldChar w:fldCharType="end"/>
+            </w:r>
+          </w:hyperlink>
+        </w:p>
+        <w:p>
+          <w:pPr>
+            <w:pStyle w:val="TDC2"/>
+            <w:tabs>
+              <w:tab w:val="right" w:leader="dot" w:pos="9350"/>
+            </w:tabs>
+            <w:rPr>
+              <w:rFonts w:eastAsiaTheme="minorEastAsia"/>
+              <w:noProof/>
+              <w:color w:val="000000" w:themeColor="text1"/>
+              <w:sz w:val="24"/>
+              <w:szCs w:val="24"/>
+              <w:lang w:val="es-ES" w:eastAsia="es-ES"/>
+            </w:rPr>
+          </w:pPr>
+          <w:hyperlink w:anchor="_Toc231651123" w:history="1">
+            <w:r>
+              <w:rPr>
+                <w:rStyle w:val="Hipervnculo"/>
+                <w:noProof/>
+                <w:color w:val="000000" w:themeColor="text1"/>
+              </w:rPr>
+              <w:t>Manejo de Datos: Roles y Jerarquías Empresariales</w:t>
+            </w:r>
+            <w:r>
+              <w:rPr>
+                <w:noProof/>
+                <w:webHidden/>
+                <w:color w:val="000000" w:themeColor="text1"/>
+              </w:rPr>
+              <w:tab/>
+            </w:r>
+            <w:r>
+              <w:rPr>
+                <w:noProof/>
+                <w:webHidden/>
+                <w:color w:val="000000" w:themeColor="text1"/>
+              </w:rPr>
+              <w:fldChar w:fldCharType="begin"/>
+            </w:r>
+            <w:r>
+              <w:rPr>
+                <w:noProof/>
+                <w:webHidden/>
+                <w:color w:val="000000" w:themeColor="text1"/>
+              </w:rPr>
+              <w:instrText xml:space="preserve"> PAGEREF _Toc231651123 \h </w:instrText>
+            </w:r>
+            <w:r>
+              <w:rPr>
+                <w:noProof/>
+                <w:webHidden/>
+                <w:color w:val="000000" w:themeColor="text1"/>
+              </w:rPr>
+            </w:r>
+            <w:r>
+              <w:rPr>
+                <w:noProof/>
+                <w:webHidden/>
+                <w:color w:val="000000" w:themeColor="text1"/>
+              </w:rPr>
+              <w:fldChar w:fldCharType="separate"/>
+            </w:r>
+            <w:r>
+              <w:rPr>
+                <w:noProof/>
+                <w:webHidden/>
+                <w:color w:val="000000" w:themeColor="text1"/>
+              </w:rPr>
+              <w:t>5</w:t>
+            </w:r>
+            <w:r>
+              <w:rPr>
+                <w:noProof/>
+                <w:webHidden/>
+                <w:color w:val="000000" w:themeColor="text1"/>
+              </w:rPr>
+              <w:fldChar w:fldCharType="end"/>
+            </w:r>
+          </w:hyperlink>
+        </w:p>
+        <w:p>
+          <w:pPr>
+            <w:pStyle w:val="TDC2"/>
+            <w:tabs>
+              <w:tab w:val="right" w:leader="dot" w:pos="9350"/>
+            </w:tabs>
+            <w:rPr>
+              <w:rFonts w:eastAsiaTheme="minorEastAsia"/>
+              <w:noProof/>
+              <w:color w:val="000000" w:themeColor="text1"/>
+              <w:sz w:val="24"/>
+              <w:szCs w:val="24"/>
+              <w:lang w:val="es-ES" w:eastAsia="es-ES"/>
+            </w:rPr>
+          </w:pPr>
+          <w:hyperlink w:anchor="_Toc231651124" w:history="1">
+            <w:r>
+              <w:rPr>
+                <w:rStyle w:val="Hipervnculo"/>
+                <w:noProof/>
+                <w:color w:val="000000" w:themeColor="text1"/>
+              </w:rPr>
+              <w:t>Conceptos Únicos de la Evolución Industrial</w:t>
+            </w:r>
+            <w:r>
+              <w:rPr>
+                <w:noProof/>
+                <w:webHidden/>
+                <w:color w:val="000000" w:themeColor="text1"/>
+              </w:rPr>
+              <w:tab/>
+            </w:r>
+            <w:r>
+              <w:rPr>
+                <w:noProof/>
+                <w:webHidden/>
+                <w:color w:val="000000" w:themeColor="text1"/>
+              </w:rPr>
+              <w:fldChar w:fldCharType="begin"/>
+            </w:r>
+            <w:r>
+              <w:rPr>
+                <w:noProof/>
+                <w:webHidden/>
+                <w:color w:val="000000" w:themeColor="text1"/>
+              </w:rPr>
+              <w:instrText xml:space="preserve"> PAGEREF _Toc231651124 \h </w:instrText>
+            </w:r>
+            <w:r>
+              <w:rPr>
+                <w:noProof/>
+                <w:webHidden/>
+                <w:color w:val="000000" w:themeColor="text1"/>
+              </w:rPr>
+            </w:r>
+            <w:r>
+              <w:rPr>
+                <w:noProof/>
+                <w:webHidden/>
+                <w:color w:val="000000" w:themeColor="text1"/>
+              </w:rPr>
+              <w:fldChar w:fldCharType="separate"/>
+            </w:r>
+            <w:r>
+              <w:rPr>
+                <w:noProof/>
+                <w:webHidden/>
+                <w:color w:val="000000" w:themeColor="text1"/>
+              </w:rPr>
+              <w:t>5</w:t>
+            </w:r>
+            <w:r>
+              <w:rPr>
+                <w:noProof/>
+                <w:webHidden/>
+                <w:color w:val="000000" w:themeColor="text1"/>
+              </w:rPr>
+              <w:fldChar w:fldCharType="end"/>
+            </w:r>
+          </w:hyperlink>
+        </w:p>
+        <w:p>
+          <w:pPr>
+            <w:pStyle w:val="TDC2"/>
+            <w:tabs>
+              <w:tab w:val="right" w:leader="dot" w:pos="9350"/>
+            </w:tabs>
+            <w:rPr>
+              <w:rFonts w:eastAsiaTheme="minorEastAsia"/>
+              <w:noProof/>
+              <w:color w:val="000000" w:themeColor="text1"/>
+              <w:sz w:val="24"/>
+              <w:szCs w:val="24"/>
+              <w:lang w:val="es-ES" w:eastAsia="es-ES"/>
+            </w:rPr>
+          </w:pPr>
+          <w:hyperlink w:anchor="_Toc231651125" w:history="1">
+            <w:r>
+              <w:rPr>
+                <w:rStyle w:val="Hipervnculo"/>
+                <w:noProof/>
+                <w:color w:val="000000" w:themeColor="text1"/>
+              </w:rPr>
+              <w:t>casos reales</w:t>
+            </w:r>
+            <w:r>
+              <w:rPr>
+                <w:noProof/>
+                <w:webHidden/>
+                <w:color w:val="000000" w:themeColor="text1"/>
+              </w:rPr>
+              <w:tab/>
+            </w:r>
+            <w:r>
+              <w:rPr>
+                <w:noProof/>
+                <w:webHidden/>
+                <w:color w:val="000000" w:themeColor="text1"/>
+              </w:rPr>
+              <w:fldChar w:fldCharType="begin"/>
+            </w:r>
+            <w:r>
+              <w:rPr>
+                <w:noProof/>
+                <w:webHidden/>
+                <w:color w:val="000000" w:themeColor="text1"/>
+              </w:rPr>
+              <w:instrText xml:space="preserve"> PAGEREF _Toc231651125 \h </w:instrText>
+            </w:r>
+            <w:r>
+              <w:rPr>
+                <w:noProof/>
+                <w:webHidden/>
+                <w:color w:val="000000" w:themeColor="text1"/>
+              </w:rPr>
+            </w:r>
+            <w:r>
+              <w:rPr>
+                <w:noProof/>
+                <w:webHidden/>
+                <w:color w:val="000000" w:themeColor="text1"/>
+              </w:rPr>
+              <w:fldChar w:fldCharType="separate"/>
+            </w:r>
+            <w:r>
+              <w:rPr>
+                <w:noProof/>
+                <w:webHidden/>
+                <w:color w:val="000000" w:themeColor="text1"/>
+              </w:rPr>
+              <w:t>6</w:t>
+            </w:r>
+            <w:r>
+              <w:rPr>
+                <w:noProof/>
+                <w:webHidden/>
+                <w:color w:val="000000" w:themeColor="text1"/>
+              </w:rPr>
+              <w:fldChar w:fldCharType="end"/>
+            </w:r>
+          </w:hyperlink>
+        </w:p>
+        <w:p>
+          <w:pPr>
+            <w:pStyle w:val="TDC1"/>
+            <w:tabs>
+              <w:tab w:val="right" w:leader="dot" w:pos="9350"/>
+            </w:tabs>
+            <w:rPr>
+              <w:rFonts w:eastAsiaTheme="minorEastAsia"/>
+              <w:noProof/>
+              <w:color w:val="000000" w:themeColor="text1"/>
+              <w:sz w:val="24"/>
+              <w:szCs w:val="24"/>
+              <w:lang w:val="es-ES" w:eastAsia="es-ES"/>
+            </w:rPr>
+          </w:pPr>
+          <w:hyperlink w:anchor="_Toc231651126" w:history="1">
+            <w:r>
+              <w:rPr>
+                <w:rStyle w:val="Hipervnculo"/>
+                <w:noProof/>
+                <w:color w:val="000000" w:themeColor="text1"/>
+              </w:rPr>
+              <w:t>Pregunta de Investigación</w:t>
+            </w:r>
+            <w:r>
+              <w:rPr>
+                <w:noProof/>
+                <w:webHidden/>
+                <w:color w:val="000000" w:themeColor="text1"/>
+              </w:rPr>
+              <w:tab/>
+            </w:r>
+            <w:r>
+              <w:rPr>
+                <w:noProof/>
+                <w:webHidden/>
+                <w:color w:val="000000" w:themeColor="text1"/>
+              </w:rPr>
+              <w:fldChar w:fldCharType="begin"/>
+            </w:r>
+            <w:r>
+              <w:rPr>
+                <w:noProof/>
+                <w:webHidden/>
+                <w:color w:val="000000" w:themeColor="text1"/>
+              </w:rPr>
+              <w:instrText xml:space="preserve"> PAGEREF _Toc231651126 \h </w:instrText>
+            </w:r>
+            <w:r>
+              <w:rPr>
+                <w:noProof/>
+                <w:webHidden/>
+                <w:color w:val="000000" w:themeColor="text1"/>
+              </w:rPr>
+            </w:r>
+            <w:r>
+              <w:rPr>
+                <w:noProof/>
+                <w:webHidden/>
+                <w:color w:val="000000" w:themeColor="text1"/>
+              </w:rPr>
+              <w:fldChar w:fldCharType="separate"/>
+            </w:r>
+            <w:r>
+              <w:rPr>
+                <w:noProof/>
+                <w:webHidden/>
+                <w:color w:val="000000" w:themeColor="text1"/>
+              </w:rPr>
+              <w:t>9</w:t>
+            </w:r>
+            <w:r>
+              <w:rPr>
+                <w:noProof/>
+                <w:webHidden/>
+                <w:color w:val="000000" w:themeColor="text1"/>
+              </w:rPr>
+              <w:fldChar w:fldCharType="end"/>
+            </w:r>
+          </w:hyperlink>
+        </w:p>
+        <w:p>
+          <w:pPr>
+            <w:pStyle w:val="TDC1"/>
+            <w:tabs>
+              <w:tab w:val="right" w:leader="dot" w:pos="9350"/>
+            </w:tabs>
+            <w:rPr>
+              <w:rFonts w:eastAsiaTheme="minorEastAsia"/>
+              <w:noProof/>
+              <w:color w:val="000000" w:themeColor="text1"/>
+              <w:sz w:val="24"/>
+              <w:szCs w:val="24"/>
+              <w:lang w:val="es-ES" w:eastAsia="es-ES"/>
+            </w:rPr>
+          </w:pPr>
+          <w:hyperlink w:anchor="_Toc231651127" w:history="1">
+            <w:r>
+              <w:rPr>
+                <w:rStyle w:val="Hipervnculo"/>
+                <w:noProof/>
+                <w:color w:val="000000" w:themeColor="text1"/>
+              </w:rPr>
+              <w:t>Objetivo General:</w:t>
+            </w:r>
+            <w:r>
+              <w:rPr>
+                <w:noProof/>
+                <w:webHidden/>
+                <w:color w:val="000000" w:themeColor="text1"/>
+              </w:rPr>
+              <w:tab/>
+            </w:r>
+            <w:r>
+              <w:rPr>
+                <w:noProof/>
+                <w:webHidden/>
+                <w:color w:val="000000" w:themeColor="text1"/>
+              </w:rPr>
+              <w:fldChar w:fldCharType="begin"/>
+            </w:r>
+            <w:r>
+              <w:rPr>
+                <w:noProof/>
+                <w:webHidden/>
+                <w:color w:val="000000" w:themeColor="text1"/>
+              </w:rPr>
+              <w:instrText xml:space="preserve"> PAGEREF _Toc231651127 \h </w:instrText>
+            </w:r>
+            <w:r>
+              <w:rPr>
+                <w:noProof/>
+                <w:webHidden/>
+                <w:color w:val="000000" w:themeColor="text1"/>
+              </w:rPr>
+            </w:r>
+            <w:r>
+              <w:rPr>
+                <w:noProof/>
+                <w:webHidden/>
+                <w:color w:val="000000" w:themeColor="text1"/>
+              </w:rPr>
+              <w:fldChar w:fldCharType="separate"/>
+            </w:r>
+            <w:r>
+              <w:rPr>
+                <w:noProof/>
+                <w:webHidden/>
+                <w:color w:val="000000" w:themeColor="text1"/>
+              </w:rPr>
+              <w:t>10</w:t>
+            </w:r>
+            <w:r>
+              <w:rPr>
+                <w:noProof/>
+                <w:webHidden/>
+                <w:color w:val="000000" w:themeColor="text1"/>
+              </w:rPr>
+              <w:fldChar w:fldCharType="end"/>
+            </w:r>
+          </w:hyperlink>
+        </w:p>
+        <w:p>
+          <w:pPr>
+            <w:pStyle w:val="TDC1"/>
+            <w:tabs>
+              <w:tab w:val="right" w:leader="dot" w:pos="9350"/>
+            </w:tabs>
+            <w:rPr>
+              <w:rFonts w:eastAsiaTheme="minorEastAsia"/>
+              <w:noProof/>
+              <w:color w:val="000000" w:themeColor="text1"/>
+              <w:sz w:val="24"/>
+              <w:szCs w:val="24"/>
+              <w:lang w:val="es-ES" w:eastAsia="es-ES"/>
+            </w:rPr>
+          </w:pPr>
+          <w:hyperlink w:anchor="_Toc231651128" w:history="1">
+            <w:r>
+              <w:rPr>
+                <w:rStyle w:val="Hipervnculo"/>
+                <w:noProof/>
+                <w:color w:val="000000" w:themeColor="text1"/>
+              </w:rPr>
+              <w:t>Objetivo Especifico:</w:t>
+            </w:r>
+            <w:r>
+              <w:rPr>
+                <w:noProof/>
+                <w:webHidden/>
+                <w:color w:val="000000" w:themeColor="text1"/>
+              </w:rPr>
+              <w:tab/>
+            </w:r>
+            <w:r>
+              <w:rPr>
+                <w:noProof/>
+                <w:webHidden/>
+                <w:color w:val="000000" w:themeColor="text1"/>
+              </w:rPr>
+              <w:fldChar w:fldCharType="begin"/>
+            </w:r>
+            <w:r>
+              <w:rPr>
+                <w:noProof/>
+                <w:webHidden/>
+                <w:color w:val="000000" w:themeColor="text1"/>
+              </w:rPr>
+              <w:instrText xml:space="preserve"> PAGEREF _Toc231651128 \h </w:instrText>
+            </w:r>
+            <w:r>
+              <w:rPr>
+                <w:noProof/>
+                <w:webHidden/>
+                <w:color w:val="000000" w:themeColor="text1"/>
+              </w:rPr>
+            </w:r>
+            <w:r>
+              <w:rPr>
+                <w:noProof/>
+                <w:webHidden/>
+                <w:color w:val="000000" w:themeColor="text1"/>
+              </w:rPr>
+              <w:fldChar w:fldCharType="separate"/>
+            </w:r>
+            <w:r>
+              <w:rPr>
+                <w:noProof/>
+                <w:webHidden/>
+                <w:color w:val="000000" w:themeColor="text1"/>
+              </w:rPr>
+              <w:t>10</w:t>
+            </w:r>
+            <w:r>
+              <w:rPr>
+                <w:noProof/>
+                <w:webHidden/>
+                <w:color w:val="000000" w:themeColor="text1"/>
+              </w:rPr>
+              <w:fldChar w:fldCharType="end"/>
+            </w:r>
+          </w:hyperlink>
+        </w:p>
+        <w:p>
+          <w:pPr>
+            <w:pStyle w:val="TDC1"/>
+            <w:tabs>
+              <w:tab w:val="right" w:leader="dot" w:pos="9350"/>
+            </w:tabs>
+            <w:rPr>
+              <w:rFonts w:eastAsiaTheme="minorEastAsia"/>
+              <w:noProof/>
+              <w:color w:val="000000" w:themeColor="text1"/>
+              <w:sz w:val="24"/>
+              <w:szCs w:val="24"/>
+              <w:lang w:val="es-ES" w:eastAsia="es-ES"/>
+            </w:rPr>
+          </w:pPr>
+          <w:hyperlink w:anchor="_Toc231651129" w:history="1">
+            <w:r>
+              <w:rPr>
+                <w:rStyle w:val="Hipervnculo"/>
+                <w:noProof/>
+                <w:color w:val="000000" w:themeColor="text1"/>
+              </w:rPr>
+              <w:t>Justificación:</w:t>
+            </w:r>
+            <w:r>
+              <w:rPr>
+                <w:noProof/>
+                <w:webHidden/>
+                <w:color w:val="000000" w:themeColor="text1"/>
+              </w:rPr>
+              <w:tab/>
+            </w:r>
+            <w:r>
+              <w:rPr>
+                <w:noProof/>
+                <w:webHidden/>
+                <w:color w:val="000000" w:themeColor="text1"/>
+              </w:rPr>
+              <w:fldChar w:fldCharType="begin"/>
+            </w:r>
+            <w:r>
+              <w:rPr>
+                <w:noProof/>
+                <w:webHidden/>
+                <w:color w:val="000000" w:themeColor="text1"/>
+              </w:rPr>
+              <w:instrText xml:space="preserve"> PAGEREF _Toc231651129 \h </w:instrText>
+            </w:r>
+            <w:r>
+              <w:rPr>
+                <w:noProof/>
+                <w:webHidden/>
+                <w:color w:val="000000" w:themeColor="text1"/>
+              </w:rPr>
+            </w:r>
+            <w:r>
+              <w:rPr>
+                <w:noProof/>
+                <w:webHidden/>
+                <w:color w:val="000000" w:themeColor="text1"/>
+              </w:rPr>
+              <w:fldChar w:fldCharType="separate"/>
+            </w:r>
+            <w:r>
+              <w:rPr>
+                <w:noProof/>
+                <w:webHidden/>
+                <w:color w:val="000000" w:themeColor="text1"/>
+              </w:rPr>
+              <w:t>11</w:t>
+            </w:r>
+            <w:r>
+              <w:rPr>
+                <w:noProof/>
+                <w:webHidden/>
+                <w:color w:val="000000" w:themeColor="text1"/>
+              </w:rPr>
+              <w:fldChar w:fldCharType="end"/>
+            </w:r>
+          </w:hyperlink>
+        </w:p>
+        <w:p>
+          <w:pPr>
+            <w:rPr>
+              <w:color w:val="000000" w:themeColor="text1"/>
+            </w:rPr>
+          </w:pPr>
+          <w:r>
+            <w:rPr>
+              <w:b/>
+              <w:bCs/>
+              <w:color w:val="000000" w:themeColor="text1"/>
+              <w:lang w:val="es-MX"/>
+            </w:rPr>
+            <w:fldChar w:fldCharType="end"/>
+          </w:r>
+        </w:p>
+      </w:sdtContent>
+    </w:sdt>
+    <w:p>
+      <w:pPr>
+        <w:rPr>
+          <w:color w:val="000000" w:themeColor="text1"/>
+        </w:rPr>
+      </w:pPr>
+    </w:p>
+    <w:p>
+      <w:pPr>
+        <w:rPr>
+          <w:color w:val="000000" w:themeColor="text1"/>
+        </w:rPr>
+      </w:pPr>
+    </w:p>
+    <w:p>
+      <w:pPr>
+        <w:rPr>
+          <w:color w:val="000000" w:themeColor="text1"/>
+        </w:rPr>
+      </w:pPr>
+    </w:p>
+    <w:p>
+      <w:pPr>
+        <w:rPr>
+          <w:color w:val="000000" w:themeColor="text1"/>
+        </w:rPr>
+      </w:pPr>
+    </w:p>
+    <w:p>
+      <w:pPr>
+        <w:rPr>
+          <w:color w:val="000000" w:themeColor="text1"/>
+        </w:rPr>
+      </w:pPr>
+    </w:p>
+    <w:p>
+      <w:pPr>
+        <w:rPr>
+          <w:color w:val="000000" w:themeColor="text1"/>
+        </w:rPr>
+      </w:pPr>
+    </w:p>
+    <w:p>
+      <w:pPr>
+        <w:rPr>
+          <w:color w:val="000000" w:themeColor="text1"/>
+        </w:rPr>
+      </w:pPr>
+    </w:p>
+    <w:p>
+      <w:pPr>
+        <w:rPr>
+          <w:color w:val="000000" w:themeColor="text1"/>
+        </w:rPr>
+      </w:pPr>
+    </w:p>
+    <w:p>
+      <w:pPr>
+        <w:rPr>
+          <w:color w:val="000000" w:themeColor="text1"/>
+        </w:rPr>
+      </w:pPr>
+    </w:p>
+    <w:p>
+      <w:pPr>
+        <w:rPr>
+          <w:color w:val="000000" w:themeColor="text1"/>
+        </w:rPr>
+      </w:pPr>
+    </w:p>
+    <w:p>
+      <w:pPr>
+        <w:rPr>
+          <w:color w:val="000000" w:themeColor="text1"/>
+        </w:rPr>
+      </w:pPr>
+    </w:p>
+    <w:p>
+      <w:pPr>
+        <w:rPr>
+          <w:color w:val="000000" w:themeColor="text1"/>
+        </w:rPr>
+      </w:pPr>
+    </w:p>
+    <w:p>
+      <w:pPr>
+        <w:rPr>
+          <w:color w:val="000000" w:themeColor="text1"/>
+        </w:rPr>
+      </w:pPr>
+    </w:p>
+    <w:p>
+      <w:pPr>
+        <w:rPr>
+          <w:color w:val="000000" w:themeColor="text1"/>
+        </w:rPr>
+      </w:pPr>
+    </w:p>
+    <w:p>
+      <w:pPr>
+        <w:rPr>
+          <w:color w:val="000000" w:themeColor="text1"/>
+        </w:rPr>
+      </w:pPr>
+    </w:p>
+    <w:p>
+      <w:pPr>
+        <w:rPr>
+          <w:color w:val="000000" w:themeColor="text1"/>
+        </w:rPr>
+      </w:pPr>
+    </w:p>
+    <w:p>
+      <w:pPr>
+        <w:rPr>
+          <w:color w:val="000000" w:themeColor="text1"/>
+        </w:rPr>
+      </w:pPr>
+    </w:p>
+    <w:p>
+      <w:pPr>
+        <w:rPr>
+          <w:color w:val="000000" w:themeColor="text1"/>
+        </w:rPr>
+      </w:pPr>
+    </w:p>
+    <w:p>
+      <w:pPr>
+        <w:rPr>
+          <w:color w:val="000000" w:themeColor="text1"/>
+        </w:rPr>
+      </w:pPr>
+    </w:p>
+    <w:p>
+      <w:pPr>
         <w:rPr>
           <w:rFonts w:ascii="Times New Roman" w:hAnsi="Times New Roman" w:cs="Times New Roman"/>
           <w:b/>
           <w:bCs/>
-          <w:sz w:val="24"/>
-          <w:szCs w:val="24"/>
-        </w:rPr>
-        <w:lastRenderedPageBreak/>
-        <w:t>Antecedentes:</w:t>
-      </w:r>
-    </w:p>
-    <w:p>
-      <w:pPr>
-        <w:rPr>
-          <w:rFonts w:ascii="Times New Roman" w:hAnsi="Times New Roman" w:cs="Times New Roman"/>
-          <w:sz w:val="24"/>
-          <w:szCs w:val="24"/>
-        </w:rPr>
-      </w:pPr>
-      <w:r>
-        <w:rPr>
-          <w:rFonts w:ascii="Times New Roman" w:hAnsi="Times New Roman" w:cs="Times New Roman"/>
+          <w:color w:val="000000" w:themeColor="text1"/>
+          <w:sz w:val="24"/>
+          <w:szCs w:val="24"/>
+        </w:rPr>
+      </w:pPr>
+      <w:bookmarkStart w:id="0" w:name="_Toc231651122"/>
+      <w:r>
+        <w:rPr>
+          <w:rStyle w:val="Ttulo1Car"/>
+          <w:color w:val="000000" w:themeColor="text1"/>
+        </w:rPr>
+        <w:t>Antecedentes</w:t>
+      </w:r>
+      <w:bookmarkEnd w:id="0"/>
+      <w:r>
+        <w:rPr>
+          <w:rFonts w:ascii="Times New Roman" w:hAnsi="Times New Roman" w:cs="Times New Roman"/>
+          <w:b/>
+          <w:bCs/>
+          <w:color w:val="000000" w:themeColor="text1"/>
+          <w:sz w:val="24"/>
+          <w:szCs w:val="24"/>
+        </w:rPr>
+        <w:t>:</w:t>
+      </w:r>
+    </w:p>
+    <w:p>
+      <w:pPr>
+        <w:rPr>
+          <w:rFonts w:ascii="Times New Roman" w:hAnsi="Times New Roman" w:cs="Times New Roman"/>
+          <w:color w:val="000000" w:themeColor="text1"/>
+          <w:sz w:val="24"/>
+          <w:szCs w:val="24"/>
+        </w:rPr>
+      </w:pPr>
+      <w:r>
+        <w:rPr>
+          <w:rFonts w:ascii="Times New Roman" w:hAnsi="Times New Roman" w:cs="Times New Roman"/>
+          <w:color w:val="000000" w:themeColor="text1"/>
           <w:sz w:val="24"/>
           <w:szCs w:val="24"/>
         </w:rPr>
@@ -377,13 +1328,15 @@
         </w:numPr>
         <w:rPr>
           <w:rFonts w:ascii="Times New Roman" w:hAnsi="Times New Roman" w:cs="Times New Roman"/>
-          <w:sz w:val="24"/>
-          <w:szCs w:val="24"/>
-        </w:rPr>
-      </w:pPr>
-      <w:r>
-        <w:rPr>
-          <w:rFonts w:ascii="Times New Roman" w:hAnsi="Times New Roman" w:cs="Times New Roman"/>
+          <w:color w:val="000000" w:themeColor="text1"/>
+          <w:sz w:val="24"/>
+          <w:szCs w:val="24"/>
+        </w:rPr>
+      </w:pPr>
+      <w:r>
+        <w:rPr>
+          <w:rFonts w:ascii="Times New Roman" w:hAnsi="Times New Roman" w:cs="Times New Roman"/>
+          <w:color w:val="000000" w:themeColor="text1"/>
           <w:sz w:val="24"/>
           <w:szCs w:val="24"/>
         </w:rPr>
@@ -395,33 +1348,19 @@
         <w:ind w:left="360"/>
         <w:rPr>
           <w:rFonts w:ascii="Times New Roman" w:hAnsi="Times New Roman" w:cs="Times New Roman"/>
-          <w:sz w:val="24"/>
-          <w:szCs w:val="24"/>
-        </w:rPr>
-      </w:pPr>
-      <w:r>
-        <w:rPr>
-          <w:rFonts w:ascii="Times New Roman" w:hAnsi="Times New Roman" w:cs="Times New Roman"/>
-          <w:sz w:val="24"/>
-          <w:szCs w:val="24"/>
-        </w:rPr>
-        <w:t xml:space="preserve">Planificar el dinero en una empresa siempre ha sido un dolor de cabeza, pero la forma de enfrentar este reto ha cambiado por completo gracias a la tecnología. No estamos hablando solo de cambiar un cuaderno por una computadora, sino de un cambio radical en cómo los negocios cuidan sus recursos financieros. Para entender por qué se va a construir este software, es fundamental mirar cómo colapsaban los métodos del pasado, a </w:t>
-      </w:r>
-      <w:r>
-        <w:rPr>
-          <w:rFonts w:ascii="Times New Roman" w:hAnsi="Times New Roman" w:cs="Times New Roman"/>
-          <w:sz w:val="24"/>
-          <w:szCs w:val="24"/>
-        </w:rPr>
-        <w:t>continuación,</w:t>
-      </w:r>
-      <w:r>
-        <w:rPr>
-          <w:rFonts w:ascii="Times New Roman" w:hAnsi="Times New Roman" w:cs="Times New Roman"/>
-          <w:sz w:val="24"/>
-          <w:szCs w:val="24"/>
-        </w:rPr>
-        <w:t xml:space="preserve"> más detalles.</w:t>
+          <w:color w:val="000000" w:themeColor="text1"/>
+          <w:sz w:val="24"/>
+          <w:szCs w:val="24"/>
+        </w:rPr>
+      </w:pPr>
+      <w:r>
+        <w:rPr>
+          <w:rFonts w:ascii="Times New Roman" w:hAnsi="Times New Roman" w:cs="Times New Roman"/>
+          <w:color w:val="000000" w:themeColor="text1"/>
+          <w:sz w:val="24"/>
+          <w:szCs w:val="24"/>
+        </w:rPr>
+        <w:t>Planificar el dinero en una empresa siempre ha sido un dolor de cabeza, pero la forma de enfrentar este reto ha cambiado por completo gracias a la tecnología. No estamos hablando solo de cambiar un cuaderno por una computadora, sino de un cambio radical en cómo los negocios cuidan sus recursos financieros. Para entender por qué se va a construir este software, es fundamental mirar cómo colapsaban los métodos del pasado, a continuación, más detalles.</w:t>
       </w:r>
     </w:p>
     <w:p>
@@ -429,13 +1368,15 @@
         <w:ind w:left="360"/>
         <w:rPr>
           <w:rFonts w:ascii="Times New Roman" w:hAnsi="Times New Roman" w:cs="Times New Roman"/>
-          <w:sz w:val="24"/>
-          <w:szCs w:val="24"/>
-        </w:rPr>
-      </w:pPr>
-      <w:r>
-        <w:rPr>
-          <w:rFonts w:ascii="Times New Roman" w:hAnsi="Times New Roman" w:cs="Times New Roman"/>
+          <w:color w:val="000000" w:themeColor="text1"/>
+          <w:sz w:val="24"/>
+          <w:szCs w:val="24"/>
+        </w:rPr>
+      </w:pPr>
+      <w:r>
+        <w:rPr>
+          <w:rFonts w:ascii="Times New Roman" w:hAnsi="Times New Roman" w:cs="Times New Roman"/>
+          <w:color w:val="000000" w:themeColor="text1"/>
           <w:sz w:val="24"/>
           <w:szCs w:val="24"/>
         </w:rPr>
@@ -447,13 +1388,15 @@
         <w:ind w:left="360"/>
         <w:rPr>
           <w:rFonts w:ascii="Times New Roman" w:hAnsi="Times New Roman" w:cs="Times New Roman"/>
-          <w:sz w:val="24"/>
-          <w:szCs w:val="24"/>
-        </w:rPr>
-      </w:pPr>
-      <w:r>
-        <w:rPr>
-          <w:rFonts w:ascii="Times New Roman" w:hAnsi="Times New Roman" w:cs="Times New Roman"/>
+          <w:color w:val="000000" w:themeColor="text1"/>
+          <w:sz w:val="24"/>
+          <w:szCs w:val="24"/>
+        </w:rPr>
+      </w:pPr>
+      <w:r>
+        <w:rPr>
+          <w:rFonts w:ascii="Times New Roman" w:hAnsi="Times New Roman" w:cs="Times New Roman"/>
+          <w:color w:val="000000" w:themeColor="text1"/>
           <w:sz w:val="24"/>
           <w:szCs w:val="24"/>
         </w:rPr>
@@ -465,49 +1408,19 @@
         <w:ind w:left="360"/>
         <w:rPr>
           <w:rFonts w:ascii="Times New Roman" w:hAnsi="Times New Roman" w:cs="Times New Roman"/>
-          <w:sz w:val="24"/>
-          <w:szCs w:val="24"/>
-        </w:rPr>
-      </w:pPr>
-      <w:r>
-        <w:rPr>
-          <w:rFonts w:ascii="Times New Roman" w:hAnsi="Times New Roman" w:cs="Times New Roman"/>
-          <w:sz w:val="24"/>
-          <w:szCs w:val="24"/>
-        </w:rPr>
-        <w:t xml:space="preserve">Hoy en día, las organizaciones medianas y grandes no pueden sobrevivir con archivos sueltos; necesitan bases de datos centralizadas como SQL Server conectadas a sistemas de planificación de recursos, aunque se maneja mucho lo que es </w:t>
-      </w:r>
-      <w:r>
-        <w:rPr>
-          <w:rFonts w:ascii="Times New Roman" w:hAnsi="Times New Roman" w:cs="Times New Roman"/>
-          <w:sz w:val="24"/>
-          <w:szCs w:val="24"/>
-        </w:rPr>
-        <w:t>Excel</w:t>
-      </w:r>
-      <w:r>
-        <w:rPr>
-          <w:rFonts w:ascii="Times New Roman" w:hAnsi="Times New Roman" w:cs="Times New Roman"/>
-          <w:sz w:val="24"/>
-          <w:szCs w:val="24"/>
-        </w:rPr>
-        <w:t xml:space="preserve"> en la actualidad muchas empresas tienen sus movimientos en bases de datos que bien son xslx o csv, La verdadera revolución aquí es que el control financiero que dejó de ser reactivo y pasó a ser preventivo. los sistemas se comenzaron a desarrollar con el fin de no limitar a registrar en qué se gastó el dinero, sino que a cuidar los fondos en tiempo real. Si un empleado intenta registrar una compra que sobrepasa el límite asignado para su área, </w:t>
-      </w:r>
-      <w:r>
-        <w:rPr>
-          <w:rFonts w:ascii="Times New Roman" w:hAnsi="Times New Roman" w:cs="Times New Roman"/>
-          <w:sz w:val="24"/>
-          <w:szCs w:val="24"/>
-        </w:rPr>
-        <w:t>los softwares detendrán</w:t>
-      </w:r>
-      <w:r>
-        <w:rPr>
-          <w:rFonts w:ascii="Times New Roman" w:hAnsi="Times New Roman" w:cs="Times New Roman"/>
-          <w:sz w:val="24"/>
-          <w:szCs w:val="24"/>
-        </w:rPr>
-        <w:t xml:space="preserve"> la transacción inmediatamente, bloqueando el movimiento antes de que el dinero salga de la cuenta bancaria de la empresa, o bien creando la alerta antes de hacer la transacción</w:t>
+          <w:color w:val="000000" w:themeColor="text1"/>
+          <w:sz w:val="24"/>
+          <w:szCs w:val="24"/>
+        </w:rPr>
+      </w:pPr>
+      <w:r>
+        <w:rPr>
+          <w:rFonts w:ascii="Times New Roman" w:hAnsi="Times New Roman" w:cs="Times New Roman"/>
+          <w:color w:val="000000" w:themeColor="text1"/>
+          <w:sz w:val="24"/>
+          <w:szCs w:val="24"/>
+        </w:rPr>
+        <w:t>Hoy en día, las organizaciones medianas y grandes no pueden sobrevivir con archivos sueltos; necesitan bases de datos centralizadas como SQL Server conectadas a sistemas de planificación de recursos, aunque se maneja mucho lo que es Excel en la actualidad muchas empresas tienen sus movimientos en bases de datos que bien son xslx o csv, La verdadera revolución aquí es que el control financiero que dejó de ser reactivo y pasó a ser preventivo. los sistemas se comenzaron a desarrollar con el fin de no limitar a registrar en qué se gastó el dinero, sino que a cuidar los fondos en tiempo real. Si un empleado intenta registrar una compra que sobrepasa el límite asignado para su área, los softwares detendrán la transacción inmediatamente, bloqueando el movimiento antes de que el dinero salga de la cuenta bancaria de la empresa, o bien creando la alerta antes de hacer la transacción</w:t>
       </w:r>
     </w:p>
     <w:p>
@@ -515,58 +1428,49 @@
         <w:ind w:left="360"/>
         <w:rPr>
           <w:rFonts w:ascii="Times New Roman" w:hAnsi="Times New Roman" w:cs="Times New Roman"/>
-          <w:sz w:val="24"/>
-          <w:szCs w:val="24"/>
-        </w:rPr>
-      </w:pPr>
-    </w:p>
-    <w:p>
-      <w:pPr>
-        <w:pStyle w:val="Prrafodelista"/>
-        <w:numPr>
-          <w:ilvl w:val="0"/>
-          <w:numId w:val="1"/>
-        </w:numPr>
-        <w:rPr>
-          <w:rFonts w:ascii="Times New Roman" w:hAnsi="Times New Roman" w:cs="Times New Roman"/>
-          <w:b/>
-          <w:bCs/>
-          <w:sz w:val="24"/>
-          <w:szCs w:val="24"/>
-        </w:rPr>
-      </w:pPr>
-      <w:r>
-        <w:rPr>
-          <w:rFonts w:ascii="Times New Roman" w:hAnsi="Times New Roman" w:cs="Times New Roman"/>
-          <w:sz w:val="24"/>
-          <w:szCs w:val="24"/>
+          <w:color w:val="000000" w:themeColor="text1"/>
+          <w:sz w:val="24"/>
+          <w:szCs w:val="24"/>
+        </w:rPr>
+      </w:pPr>
+    </w:p>
+    <w:p>
+      <w:pPr>
+        <w:pStyle w:val="Ttulo2"/>
+        <w:rPr>
+          <w:color w:val="000000" w:themeColor="text1"/>
+        </w:rPr>
+      </w:pPr>
+      <w:r>
+        <w:rPr>
+          <w:color w:val="000000" w:themeColor="text1"/>
         </w:rPr>
         <w:br w:type="page"/>
       </w:r>
-      <w:r>
-        <w:rPr>
-          <w:rFonts w:ascii="Times New Roman" w:hAnsi="Times New Roman" w:cs="Times New Roman"/>
-          <w:b/>
-          <w:bCs/>
-          <w:sz w:val="24"/>
-          <w:szCs w:val="24"/>
+      <w:bookmarkStart w:id="1" w:name="_Toc231651123"/>
+      <w:r>
+        <w:rPr>
+          <w:color w:val="000000" w:themeColor="text1"/>
         </w:rPr>
         <w:lastRenderedPageBreak/>
         <w:t>Manejo de Datos: Roles y Jerarquías Empresariales</w:t>
       </w:r>
+      <w:bookmarkEnd w:id="1"/>
     </w:p>
     <w:p>
       <w:pPr>
         <w:ind w:left="360"/>
         <w:rPr>
           <w:rFonts w:ascii="Times New Roman" w:hAnsi="Times New Roman" w:cs="Times New Roman"/>
-          <w:sz w:val="24"/>
-          <w:szCs w:val="24"/>
-        </w:rPr>
-      </w:pPr>
-      <w:r>
-        <w:rPr>
-          <w:rFonts w:ascii="Times New Roman" w:hAnsi="Times New Roman" w:cs="Times New Roman"/>
+          <w:color w:val="000000" w:themeColor="text1"/>
+          <w:sz w:val="24"/>
+          <w:szCs w:val="24"/>
+        </w:rPr>
+      </w:pPr>
+      <w:r>
+        <w:rPr>
+          <w:rFonts w:ascii="Times New Roman" w:hAnsi="Times New Roman" w:cs="Times New Roman"/>
+          <w:color w:val="000000" w:themeColor="text1"/>
           <w:sz w:val="24"/>
           <w:szCs w:val="24"/>
         </w:rPr>
@@ -578,13 +1482,15 @@
         <w:ind w:left="360"/>
         <w:rPr>
           <w:rFonts w:ascii="Times New Roman" w:hAnsi="Times New Roman" w:cs="Times New Roman"/>
-          <w:sz w:val="24"/>
-          <w:szCs w:val="24"/>
-        </w:rPr>
-      </w:pPr>
-      <w:r>
-        <w:rPr>
-          <w:rFonts w:ascii="Times New Roman" w:hAnsi="Times New Roman" w:cs="Times New Roman"/>
+          <w:color w:val="000000" w:themeColor="text1"/>
+          <w:sz w:val="24"/>
+          <w:szCs w:val="24"/>
+        </w:rPr>
+      </w:pPr>
+      <w:r>
+        <w:rPr>
+          <w:rFonts w:ascii="Times New Roman" w:hAnsi="Times New Roman" w:cs="Times New Roman"/>
+          <w:color w:val="000000" w:themeColor="text1"/>
           <w:sz w:val="24"/>
           <w:szCs w:val="24"/>
         </w:rPr>
@@ -596,13 +1502,15 @@
         <w:ind w:left="360"/>
         <w:rPr>
           <w:rFonts w:ascii="Times New Roman" w:hAnsi="Times New Roman" w:cs="Times New Roman"/>
-          <w:sz w:val="24"/>
-          <w:szCs w:val="24"/>
-        </w:rPr>
-      </w:pPr>
-      <w:r>
-        <w:rPr>
-          <w:rFonts w:ascii="Times New Roman" w:hAnsi="Times New Roman" w:cs="Times New Roman"/>
+          <w:color w:val="000000" w:themeColor="text1"/>
+          <w:sz w:val="24"/>
+          <w:szCs w:val="24"/>
+        </w:rPr>
+      </w:pPr>
+      <w:r>
+        <w:rPr>
+          <w:rFonts w:ascii="Times New Roman" w:hAnsi="Times New Roman" w:cs="Times New Roman"/>
+          <w:color w:val="000000" w:themeColor="text1"/>
           <w:sz w:val="24"/>
           <w:szCs w:val="24"/>
         </w:rPr>
@@ -614,13 +1522,15 @@
         <w:ind w:left="360"/>
         <w:rPr>
           <w:rFonts w:ascii="Times New Roman" w:hAnsi="Times New Roman" w:cs="Times New Roman"/>
-          <w:sz w:val="24"/>
-          <w:szCs w:val="24"/>
-        </w:rPr>
-      </w:pPr>
-      <w:r>
-        <w:rPr>
-          <w:rFonts w:ascii="Times New Roman" w:hAnsi="Times New Roman" w:cs="Times New Roman"/>
+          <w:color w:val="000000" w:themeColor="text1"/>
+          <w:sz w:val="24"/>
+          <w:szCs w:val="24"/>
+        </w:rPr>
+      </w:pPr>
+      <w:r>
+        <w:rPr>
+          <w:rFonts w:ascii="Times New Roman" w:hAnsi="Times New Roman" w:cs="Times New Roman"/>
+          <w:color w:val="000000" w:themeColor="text1"/>
           <w:sz w:val="24"/>
           <w:szCs w:val="24"/>
         </w:rPr>
@@ -629,38 +1539,34 @@
     </w:p>
     <w:p>
       <w:pPr>
-        <w:pStyle w:val="Prrafodelista"/>
-        <w:numPr>
-          <w:ilvl w:val="0"/>
-          <w:numId w:val="1"/>
-        </w:numPr>
-        <w:rPr>
-          <w:rFonts w:ascii="Times New Roman" w:hAnsi="Times New Roman" w:cs="Times New Roman"/>
-          <w:sz w:val="24"/>
-          <w:szCs w:val="24"/>
-        </w:rPr>
-      </w:pPr>
-      <w:r>
-        <w:rPr>
-          <w:rFonts w:ascii="Times New Roman" w:hAnsi="Times New Roman" w:cs="Times New Roman"/>
-          <w:sz w:val="24"/>
-          <w:szCs w:val="24"/>
+        <w:pStyle w:val="Ttulo2"/>
+        <w:rPr>
+          <w:color w:val="000000" w:themeColor="text1"/>
+        </w:rPr>
+      </w:pPr>
+      <w:bookmarkStart w:id="2" w:name="_Toc231651124"/>
+      <w:r>
+        <w:rPr>
+          <w:color w:val="000000" w:themeColor="text1"/>
         </w:rPr>
         <w:t>Conceptos Únicos de la Evolución Industrial</w:t>
       </w:r>
+      <w:bookmarkEnd w:id="2"/>
     </w:p>
     <w:p>
       <w:pPr>
         <w:ind w:left="360"/>
         <w:rPr>
           <w:rFonts w:ascii="Times New Roman" w:hAnsi="Times New Roman" w:cs="Times New Roman"/>
-          <w:sz w:val="24"/>
-          <w:szCs w:val="24"/>
-        </w:rPr>
-      </w:pPr>
-      <w:r>
-        <w:rPr>
-          <w:rFonts w:ascii="Times New Roman" w:hAnsi="Times New Roman" w:cs="Times New Roman"/>
+          <w:color w:val="000000" w:themeColor="text1"/>
+          <w:sz w:val="24"/>
+          <w:szCs w:val="24"/>
+        </w:rPr>
+      </w:pPr>
+      <w:r>
+        <w:rPr>
+          <w:rFonts w:ascii="Times New Roman" w:hAnsi="Times New Roman" w:cs="Times New Roman"/>
+          <w:color w:val="000000" w:themeColor="text1"/>
           <w:sz w:val="24"/>
           <w:szCs w:val="24"/>
         </w:rPr>
@@ -672,13 +1578,15 @@
         <w:ind w:left="360"/>
         <w:rPr>
           <w:rFonts w:ascii="Times New Roman" w:hAnsi="Times New Roman" w:cs="Times New Roman"/>
-          <w:sz w:val="24"/>
-          <w:szCs w:val="24"/>
-        </w:rPr>
-      </w:pPr>
-      <w:r>
-        <w:rPr>
-          <w:rFonts w:ascii="Times New Roman" w:hAnsi="Times New Roman" w:cs="Times New Roman"/>
+          <w:color w:val="000000" w:themeColor="text1"/>
+          <w:sz w:val="24"/>
+          <w:szCs w:val="24"/>
+        </w:rPr>
+      </w:pPr>
+      <w:r>
+        <w:rPr>
+          <w:rFonts w:ascii="Times New Roman" w:hAnsi="Times New Roman" w:cs="Times New Roman"/>
+          <w:color w:val="000000" w:themeColor="text1"/>
           <w:sz w:val="24"/>
           <w:szCs w:val="24"/>
         </w:rPr>
@@ -690,6 +1598,7 @@
         <w:ind w:left="360"/>
         <w:rPr>
           <w:rFonts w:ascii="Times New Roman" w:hAnsi="Times New Roman" w:cs="Times New Roman"/>
+          <w:color w:val="000000" w:themeColor="text1"/>
           <w:sz w:val="24"/>
           <w:szCs w:val="24"/>
         </w:rPr>
@@ -700,6 +1609,7 @@
         <w:ind w:left="360"/>
         <w:rPr>
           <w:rFonts w:ascii="Times New Roman" w:hAnsi="Times New Roman" w:cs="Times New Roman"/>
+          <w:color w:val="000000" w:themeColor="text1"/>
           <w:sz w:val="24"/>
           <w:szCs w:val="24"/>
         </w:rPr>
@@ -710,6 +1620,7 @@
         <w:ind w:left="360"/>
         <w:rPr>
           <w:rFonts w:ascii="Times New Roman" w:hAnsi="Times New Roman" w:cs="Times New Roman"/>
+          <w:color w:val="000000" w:themeColor="text1"/>
           <w:sz w:val="24"/>
           <w:szCs w:val="24"/>
         </w:rPr>
@@ -720,301 +1631,199 @@
         <w:ind w:left="360"/>
         <w:rPr>
           <w:rFonts w:ascii="Times New Roman" w:hAnsi="Times New Roman" w:cs="Times New Roman"/>
-          <w:sz w:val="24"/>
-          <w:szCs w:val="24"/>
-        </w:rPr>
-      </w:pPr>
-      <w:r>
-        <w:rPr>
-          <w:rFonts w:ascii="Times New Roman" w:hAnsi="Times New Roman" w:cs="Times New Roman"/>
+          <w:color w:val="000000" w:themeColor="text1"/>
+          <w:sz w:val="24"/>
+          <w:szCs w:val="24"/>
+        </w:rPr>
+      </w:pPr>
+      <w:r>
+        <w:rPr>
+          <w:rFonts w:ascii="Times New Roman" w:hAnsi="Times New Roman" w:cs="Times New Roman"/>
+          <w:color w:val="000000" w:themeColor="text1"/>
           <w:sz w:val="24"/>
           <w:szCs w:val="24"/>
         </w:rPr>
         <w:lastRenderedPageBreak/>
-        <w:t>El segundo concepto es el linaje de datos y la trazabilidad. para eso el siguiente panorama: un auditor externo entra a revisar las finanzas y encuentra que el saldo de una cuenta no cuadra. aquí es donde entra el software que debe tener la capacidad técnica de tomar ese número final y desarmarlo hacia atrás, mostrando de forma cronológica cada transferencia, cada factura</w:t>
-      </w:r>
-      <w:r>
-        <w:rPr>
-          <w:rFonts w:ascii="Times New Roman" w:hAnsi="Times New Roman" w:cs="Times New Roman"/>
-          <w:sz w:val="24"/>
-          <w:szCs w:val="24"/>
+        <w:t>El segundo concepto es el linaje de datos y la trazabilidad. para eso el siguiente panorama: un auditor externo entra a revisar las finanzas y encuentra que el saldo de una cuenta no cuadra. aquí es donde entra el software que debe tener la capacidad técnica de tomar ese número final y desarmarlo hacia atrás, mostrando de forma cronológica cada transferencia, cada factura cada ajuste que alteró ese dinero desde que el presupuesto fue aprobado originalmente. Es la muerte definitiva de los archivos de Excel anónimos.</w:t>
+      </w:r>
+    </w:p>
+    <w:p>
+      <w:pPr>
+        <w:ind w:left="360"/>
+        <w:rPr>
+          <w:rFonts w:ascii="Times New Roman" w:hAnsi="Times New Roman" w:cs="Times New Roman"/>
+          <w:color w:val="000000" w:themeColor="text1"/>
+          <w:sz w:val="24"/>
+          <w:szCs w:val="24"/>
+        </w:rPr>
+      </w:pPr>
+      <w:r>
+        <w:rPr>
+          <w:rFonts w:ascii="Times New Roman" w:hAnsi="Times New Roman" w:cs="Times New Roman"/>
+          <w:color w:val="000000" w:themeColor="text1"/>
+          <w:sz w:val="24"/>
+          <w:szCs w:val="24"/>
+        </w:rPr>
+        <w:t>El tercer concepto son los flujos de aprobación automatizados. Esto es lo que jubila para siempre a las firmas físicas en hojas de papel que se perdían en los escritorios. Cuando un usuario de nivel operativo captura un gasto fuerte, el software evalúa el monto, revisa la categoría del gasto y, de manera inteligente, dispara una alerta al jefe directo o al director financiero correspondiente para que dé su visto bueno digital, agilizando la operación sin perder ni un milímetro de control.</w:t>
+      </w:r>
+    </w:p>
+    <w:p>
+      <w:pPr>
+        <w:ind w:left="360"/>
+        <w:rPr>
+          <w:rFonts w:ascii="Times New Roman" w:hAnsi="Times New Roman" w:cs="Times New Roman"/>
+          <w:color w:val="000000" w:themeColor="text1"/>
+          <w:sz w:val="24"/>
+          <w:szCs w:val="24"/>
+        </w:rPr>
+      </w:pPr>
+      <w:r>
+        <w:rPr>
+          <w:rFonts w:ascii="Times New Roman" w:hAnsi="Times New Roman" w:cs="Times New Roman"/>
+          <w:color w:val="000000" w:themeColor="text1"/>
+          <w:sz w:val="24"/>
+          <w:szCs w:val="24"/>
+        </w:rPr>
+        <w:t>como siguiente paso en la historia de los antecedentes del ámbito tenemos lo que son los pros y los contras al usar los softwares que se han venido desarrollando a la larga de la evolución tecnológica</w:t>
+      </w:r>
+    </w:p>
+    <w:p>
+      <w:pPr>
+        <w:ind w:left="360"/>
+        <w:rPr>
+          <w:rFonts w:ascii="Times New Roman" w:hAnsi="Times New Roman" w:cs="Times New Roman"/>
+          <w:color w:val="000000" w:themeColor="text1"/>
+          <w:sz w:val="24"/>
+          <w:szCs w:val="24"/>
+        </w:rPr>
+      </w:pPr>
+      <w:r>
+        <w:rPr>
+          <w:rFonts w:ascii="Times New Roman" w:hAnsi="Times New Roman" w:cs="Times New Roman"/>
+          <w:color w:val="000000" w:themeColor="text1"/>
+          <w:sz w:val="24"/>
+          <w:szCs w:val="24"/>
+        </w:rPr>
+        <w:t>Para la empresa, el beneficio es inmediato: visibilidad absoluta del flujo de caja en tiempo real, eliminación de procesos manuales que quitan tiempo y un blindaje total contra fraudes gracias a las alertas automáticas del sistema. Sin embargo, el gran reto es la resistencia humana. Si el software que se diseña es tosco, confuso o demasiado rígido, los empleados buscan las formas de saltárselo, lo que arruinaría una inversión económica alta en desarrollo de tecnología, aquí es donde las empresas también invierten en lo que son las capacitaciones de los empleados para asegurar un buen manejo de las nuevas integraciones.</w:t>
+      </w:r>
+    </w:p>
+    <w:p>
+      <w:pPr>
+        <w:ind w:left="360"/>
+        <w:rPr>
+          <w:rFonts w:ascii="Times New Roman" w:hAnsi="Times New Roman" w:cs="Times New Roman"/>
+          <w:color w:val="000000" w:themeColor="text1"/>
+          <w:sz w:val="24"/>
+          <w:szCs w:val="24"/>
+        </w:rPr>
+      </w:pPr>
+      <w:r>
+        <w:rPr>
+          <w:rFonts w:ascii="Times New Roman" w:hAnsi="Times New Roman" w:cs="Times New Roman"/>
+          <w:color w:val="000000" w:themeColor="text1"/>
+          <w:sz w:val="24"/>
+          <w:szCs w:val="24"/>
+        </w:rPr>
+        <w:t>Para los empleados individuales, el sistema es un arma de doble filo. Por un lado, les da autonomía, ya que la aplicación móvil o web les muestra exactamente cuánto dinero tienen disponible para operar su departamento sin tener que estar llamando a contabilidad a preguntar. Por otro lado, les quita la llamada autonomía informal. En un sistema transparente, ya no hay espacio para el yo no sabía o se me olvidó registrarlo; cualquier ineficiencia, retraso o error humano queda grabado con nombre y fecha, elevando el nivel de exigencia y responsabilidad de cada usuario.</w:t>
+      </w:r>
+    </w:p>
+    <w:p>
+      <w:pPr>
+        <w:ind w:left="360"/>
+        <w:rPr>
+          <w:rFonts w:ascii="Times New Roman" w:hAnsi="Times New Roman" w:cs="Times New Roman"/>
+          <w:color w:val="000000" w:themeColor="text1"/>
+          <w:sz w:val="24"/>
+          <w:szCs w:val="24"/>
+        </w:rPr>
+      </w:pPr>
+      <w:r>
+        <w:rPr>
+          <w:rFonts w:ascii="Times New Roman" w:hAnsi="Times New Roman" w:cs="Times New Roman"/>
+          <w:color w:val="000000" w:themeColor="text1"/>
+          <w:sz w:val="24"/>
+          <w:szCs w:val="24"/>
+        </w:rPr>
+        <w:t xml:space="preserve">para darle más énfasis vamos a entrar en lo que son registros </w:t>
+      </w:r>
+      <w:proofErr w:type="gramStart"/>
+      <w:r>
+        <w:rPr>
+          <w:rFonts w:ascii="Times New Roman" w:hAnsi="Times New Roman" w:cs="Times New Roman"/>
+          <w:color w:val="000000" w:themeColor="text1"/>
+          <w:sz w:val="24"/>
+          <w:szCs w:val="24"/>
+        </w:rPr>
+        <w:t>histórico reales</w:t>
+      </w:r>
+      <w:proofErr w:type="gramEnd"/>
+      <w:r>
+        <w:rPr>
+          <w:rFonts w:ascii="Times New Roman" w:hAnsi="Times New Roman" w:cs="Times New Roman"/>
+          <w:color w:val="000000" w:themeColor="text1"/>
+          <w:sz w:val="24"/>
+          <w:szCs w:val="24"/>
+        </w:rPr>
+        <w:t xml:space="preserve"> de como se han dado esto antecedente en la vida real, tanto como internacional y nacionales:</w:t>
+      </w:r>
+    </w:p>
+    <w:p>
+      <w:pPr>
+        <w:pStyle w:val="Ttulo2"/>
+        <w:rPr>
+          <w:color w:val="000000" w:themeColor="text1"/>
+        </w:rPr>
+      </w:pPr>
+      <w:bookmarkStart w:id="3" w:name="_Toc231651125"/>
+      <w:r>
+        <w:rPr>
+          <w:color w:val="000000" w:themeColor="text1"/>
+        </w:rPr>
+        <w:t>casos reales</w:t>
+      </w:r>
+      <w:bookmarkEnd w:id="3"/>
+      <w:r>
+        <w:rPr>
+          <w:color w:val="000000" w:themeColor="text1"/>
         </w:rPr>
         <w:t xml:space="preserve"> </w:t>
       </w:r>
-      <w:r>
-        <w:rPr>
-          <w:rFonts w:ascii="Times New Roman" w:hAnsi="Times New Roman" w:cs="Times New Roman"/>
-          <w:sz w:val="24"/>
-          <w:szCs w:val="24"/>
-        </w:rPr>
-        <w:t>cada ajuste que alteró ese dinero desde que el presupuesto fue aprobado originalmente. Es la muerte definitiva de los archivos de Excel anónimos.</w:t>
-      </w:r>
     </w:p>
     <w:p>
       <w:pPr>
         <w:ind w:left="360"/>
         <w:rPr>
           <w:rFonts w:ascii="Times New Roman" w:hAnsi="Times New Roman" w:cs="Times New Roman"/>
-          <w:sz w:val="24"/>
-          <w:szCs w:val="24"/>
-        </w:rPr>
-      </w:pPr>
-      <w:r>
-        <w:rPr>
-          <w:rFonts w:ascii="Times New Roman" w:hAnsi="Times New Roman" w:cs="Times New Roman"/>
-          <w:sz w:val="24"/>
-          <w:szCs w:val="24"/>
-        </w:rPr>
-        <w:t>El tercer concepto son los flujos de aprobación automatizados. Esto es lo que jubila para siempre a las firmas físicas en hojas de papel que se perdían en los escritorios. Cuando un usuario de nivel operativo captura un gasto fuerte, el software evalúa el monto, revisa la categoría del gasto y, de manera inteligente, dispara una alerta al jefe directo o al director financiero correspondiente para que dé su visto bueno digital, agilizando la operación sin perder ni un milímetro de control.</w:t>
-      </w:r>
-    </w:p>
-    <w:p>
-      <w:pPr>
-        <w:ind w:left="360"/>
-        <w:rPr>
-          <w:rFonts w:ascii="Times New Roman" w:hAnsi="Times New Roman" w:cs="Times New Roman"/>
-          <w:sz w:val="24"/>
-          <w:szCs w:val="24"/>
-        </w:rPr>
-      </w:pPr>
-      <w:r>
-        <w:rPr>
-          <w:rFonts w:ascii="Times New Roman" w:hAnsi="Times New Roman" w:cs="Times New Roman"/>
-          <w:sz w:val="24"/>
-          <w:szCs w:val="24"/>
-        </w:rPr>
-        <w:t xml:space="preserve">como siguiente paso en la historia </w:t>
-      </w:r>
-      <w:r>
-        <w:rPr>
-          <w:rFonts w:ascii="Times New Roman" w:hAnsi="Times New Roman" w:cs="Times New Roman"/>
-          <w:sz w:val="24"/>
-          <w:szCs w:val="24"/>
-        </w:rPr>
-        <w:t>de los antecedentes</w:t>
-      </w:r>
-      <w:r>
-        <w:rPr>
-          <w:rFonts w:ascii="Times New Roman" w:hAnsi="Times New Roman" w:cs="Times New Roman"/>
-          <w:sz w:val="24"/>
-          <w:szCs w:val="24"/>
-        </w:rPr>
-        <w:t xml:space="preserve"> del </w:t>
-      </w:r>
-      <w:r>
-        <w:rPr>
-          <w:rFonts w:ascii="Times New Roman" w:hAnsi="Times New Roman" w:cs="Times New Roman"/>
-          <w:sz w:val="24"/>
-          <w:szCs w:val="24"/>
-        </w:rPr>
-        <w:t>ámbito</w:t>
-      </w:r>
-      <w:r>
-        <w:rPr>
-          <w:rFonts w:ascii="Times New Roman" w:hAnsi="Times New Roman" w:cs="Times New Roman"/>
-          <w:sz w:val="24"/>
-          <w:szCs w:val="24"/>
-        </w:rPr>
-        <w:t xml:space="preserve"> tenemos lo que son </w:t>
-      </w:r>
-      <w:r>
-        <w:rPr>
-          <w:rFonts w:ascii="Times New Roman" w:hAnsi="Times New Roman" w:cs="Times New Roman"/>
-          <w:sz w:val="24"/>
-          <w:szCs w:val="24"/>
-        </w:rPr>
-        <w:t>los pros</w:t>
-      </w:r>
-      <w:r>
-        <w:rPr>
-          <w:rFonts w:ascii="Times New Roman" w:hAnsi="Times New Roman" w:cs="Times New Roman"/>
-          <w:sz w:val="24"/>
-          <w:szCs w:val="24"/>
-        </w:rPr>
-        <w:t xml:space="preserve"> y lo</w:t>
-      </w:r>
-      <w:r>
-        <w:rPr>
-          <w:rFonts w:ascii="Times New Roman" w:hAnsi="Times New Roman" w:cs="Times New Roman"/>
-          <w:sz w:val="24"/>
-          <w:szCs w:val="24"/>
-        </w:rPr>
-        <w:t>s</w:t>
-      </w:r>
-      <w:r>
-        <w:rPr>
-          <w:rFonts w:ascii="Times New Roman" w:hAnsi="Times New Roman" w:cs="Times New Roman"/>
-          <w:sz w:val="24"/>
-          <w:szCs w:val="24"/>
-        </w:rPr>
-        <w:t xml:space="preserve"> contras al usar </w:t>
-      </w:r>
-      <w:r>
-        <w:rPr>
-          <w:rFonts w:ascii="Times New Roman" w:hAnsi="Times New Roman" w:cs="Times New Roman"/>
-          <w:sz w:val="24"/>
-          <w:szCs w:val="24"/>
-        </w:rPr>
-        <w:t>los softwares</w:t>
-      </w:r>
-      <w:r>
-        <w:rPr>
-          <w:rFonts w:ascii="Times New Roman" w:hAnsi="Times New Roman" w:cs="Times New Roman"/>
-          <w:sz w:val="24"/>
-          <w:szCs w:val="24"/>
-        </w:rPr>
-        <w:t xml:space="preserve"> que se han venido desarrollando a la larga de la evolución tecnológica</w:t>
-      </w:r>
-    </w:p>
-    <w:p>
-      <w:pPr>
-        <w:ind w:left="360"/>
-        <w:rPr>
-          <w:rFonts w:ascii="Times New Roman" w:hAnsi="Times New Roman" w:cs="Times New Roman"/>
-          <w:sz w:val="24"/>
-          <w:szCs w:val="24"/>
-        </w:rPr>
-      </w:pPr>
-      <w:r>
-        <w:rPr>
-          <w:rFonts w:ascii="Times New Roman" w:hAnsi="Times New Roman" w:cs="Times New Roman"/>
-          <w:sz w:val="24"/>
-          <w:szCs w:val="24"/>
-        </w:rPr>
-        <w:t>Para la empresa, el beneficio es inmediato: visibilidad absoluta del flujo de caja en tiempo real, eliminación de procesos manuales que quitan tiempo y un blindaje total contra fraudes gracias a las alertas automáticas del sistema. Sin embargo, el gran reto es la resistencia humana. Si el software que se diseña es tosco, confuso o demasiado rígido, los empleados buscan las formas de saltárselo, lo que arruinaría una inversión económica alta en desarrollo de tecnología, aquí es donde las empresas también invierten en lo que son las capacitaciones de los empleados para asegurar un buen manejo de las nuevas integraciones.</w:t>
-      </w:r>
-    </w:p>
-    <w:p>
-      <w:pPr>
-        <w:ind w:left="360"/>
-        <w:rPr>
-          <w:rFonts w:ascii="Times New Roman" w:hAnsi="Times New Roman" w:cs="Times New Roman"/>
-          <w:sz w:val="24"/>
-          <w:szCs w:val="24"/>
-        </w:rPr>
-      </w:pPr>
-      <w:r>
-        <w:rPr>
-          <w:rFonts w:ascii="Times New Roman" w:hAnsi="Times New Roman" w:cs="Times New Roman"/>
-          <w:sz w:val="24"/>
-          <w:szCs w:val="24"/>
-        </w:rPr>
-        <w:t>Para los empleados individuales, el sistema es un arma de doble filo. Por un lado, les da autonomía, ya que la aplicación móvil o web les muestra exactamente cuánto dinero tienen disponible para operar su departamento sin tener que estar llamando a contabilidad a preguntar. Por otro lado, les quita la llamada autonomía informal. En un sistema transparente, ya no hay espacio para el yo no sabía o se me olvidó registrarlo; cualquier ineficiencia, retraso o error humano queda grabado con nombre y fecha, elevando el nivel de exigencia y responsabilidad de cada usuario.</w:t>
-      </w:r>
-    </w:p>
-    <w:p>
-      <w:pPr>
-        <w:ind w:left="360"/>
-        <w:rPr>
-          <w:rFonts w:ascii="Times New Roman" w:hAnsi="Times New Roman" w:cs="Times New Roman"/>
-          <w:sz w:val="24"/>
-          <w:szCs w:val="24"/>
-        </w:rPr>
-      </w:pPr>
-      <w:r>
-        <w:rPr>
-          <w:rFonts w:ascii="Times New Roman" w:hAnsi="Times New Roman" w:cs="Times New Roman"/>
-          <w:sz w:val="24"/>
-          <w:szCs w:val="24"/>
-        </w:rPr>
-        <w:t xml:space="preserve">para darle </w:t>
-      </w:r>
-      <w:r>
-        <w:rPr>
-          <w:rFonts w:ascii="Times New Roman" w:hAnsi="Times New Roman" w:cs="Times New Roman"/>
-          <w:sz w:val="24"/>
-          <w:szCs w:val="24"/>
-        </w:rPr>
-        <w:t>más</w:t>
-      </w:r>
-      <w:r>
-        <w:rPr>
-          <w:rFonts w:ascii="Times New Roman" w:hAnsi="Times New Roman" w:cs="Times New Roman"/>
-          <w:sz w:val="24"/>
-          <w:szCs w:val="24"/>
-        </w:rPr>
-        <w:t xml:space="preserve"> énfasis vamos a entrar en lo que son registros histórico reales de como se han dado esto antecedente en la vida real, tanto como internacional y nacionales:</w:t>
-      </w:r>
-    </w:p>
-    <w:p>
-      <w:pPr>
-        <w:ind w:left="360"/>
-        <w:rPr>
-          <w:rFonts w:ascii="Times New Roman" w:hAnsi="Times New Roman" w:cs="Times New Roman"/>
-          <w:sz w:val="24"/>
-          <w:szCs w:val="24"/>
-        </w:rPr>
-      </w:pPr>
-      <w:r>
-        <w:rPr>
-          <w:rFonts w:ascii="Times New Roman" w:hAnsi="Times New Roman" w:cs="Times New Roman"/>
-          <w:sz w:val="24"/>
-          <w:szCs w:val="24"/>
-        </w:rPr>
-        <w:t xml:space="preserve"> El caso de JP Morgan y el "Lobo de Londres" (</w:t>
-      </w:r>
-      <w:r>
-        <w:rPr>
-          <w:rFonts w:ascii="Times New Roman" w:hAnsi="Times New Roman" w:cs="Times New Roman"/>
-          <w:sz w:val="24"/>
-          <w:szCs w:val="24"/>
-        </w:rPr>
-        <w:t>2012) En</w:t>
-      </w:r>
-      <w:r>
-        <w:rPr>
-          <w:rFonts w:ascii="Times New Roman" w:hAnsi="Times New Roman" w:cs="Times New Roman"/>
-          <w:sz w:val="24"/>
-          <w:szCs w:val="24"/>
-        </w:rPr>
-        <w:t xml:space="preserve"> 2012, una estrategia de inversión de JP Morgan Chase falló estrepitosamente, acumulando más de 6,000 millones de dólares en pérdidas comerciales luego de que un analista configurara incorrectamente un modelo de riesgo en Excel al copiar y pegar datos manualmente entre hojas de cálculo. El error matemático crítico ocurrió dentro del modelo de Valor en Riesgo (VaR), donde se aplicó una fórmula que dividía los datos por la suma de dos tasas de riesgo en lugar de calcular su promedio exacto. Esto provocó que el sistema subestimara drásticamente el riesgo real del portafolio operativo, permitiendo a los operadores seguir tomando posiciones masivas y destructivas en derivados financieros antes de que la gerencia detectara el fallo de control </w:t>
-      </w:r>
-      <w:r>
-        <w:rPr>
-          <w:rFonts w:ascii="Times New Roman" w:hAnsi="Times New Roman" w:cs="Times New Roman"/>
+          <w:color w:val="000000" w:themeColor="text1"/>
+          <w:sz w:val="24"/>
+          <w:szCs w:val="24"/>
+        </w:rPr>
+      </w:pPr>
+      <w:r>
+        <w:rPr>
+          <w:rFonts w:ascii="Times New Roman" w:hAnsi="Times New Roman" w:cs="Times New Roman"/>
+          <w:color w:val="000000" w:themeColor="text1"/>
+          <w:sz w:val="24"/>
+          <w:szCs w:val="24"/>
+        </w:rPr>
+        <w:t xml:space="preserve"> El caso de JP Morgan y el "Lobo de Londres" (2012) En 2012, una estrategia de inversión de JP Morgan Chase falló estrepitosamente, acumulando más de 6,000 millones de dólares en pérdidas comerciales luego de que un analista configurara incorrectamente un modelo de riesgo en Excel al copiar y pegar datos manualmente entre hojas de cálculo. El error matemático crítico ocurrió dentro del modelo de Valor en Riesgo (VaR), donde se aplicó una fórmula que dividía los datos por la suma de dos tasas de riesgo en lugar de calcular su promedio exacto. Esto provocó que el sistema subestimara drásticamente el riesgo real del </w:t>
+      </w:r>
+      <w:r>
+        <w:rPr>
+          <w:rFonts w:ascii="Times New Roman" w:hAnsi="Times New Roman" w:cs="Times New Roman"/>
+          <w:color w:val="000000" w:themeColor="text1"/>
           <w:sz w:val="24"/>
           <w:szCs w:val="24"/>
         </w:rPr>
         <w:lastRenderedPageBreak/>
-        <w:t xml:space="preserve">interno, en la siguiente </w:t>
-      </w:r>
-      <w:r>
-        <w:rPr>
-          <w:rFonts w:ascii="Times New Roman" w:hAnsi="Times New Roman" w:cs="Times New Roman"/>
-          <w:sz w:val="24"/>
-          <w:szCs w:val="24"/>
-        </w:rPr>
-        <w:t>U</w:t>
-      </w:r>
-      <w:r>
-        <w:rPr>
-          <w:rFonts w:ascii="Times New Roman" w:hAnsi="Times New Roman" w:cs="Times New Roman"/>
-          <w:sz w:val="24"/>
-          <w:szCs w:val="24"/>
-        </w:rPr>
-        <w:t xml:space="preserve">rl podemos ver con </w:t>
-      </w:r>
-      <w:r>
-        <w:rPr>
-          <w:rFonts w:ascii="Times New Roman" w:hAnsi="Times New Roman" w:cs="Times New Roman"/>
-          <w:sz w:val="24"/>
-          <w:szCs w:val="24"/>
-        </w:rPr>
-        <w:t>más</w:t>
-      </w:r>
-      <w:r>
-        <w:rPr>
-          <w:rFonts w:ascii="Times New Roman" w:hAnsi="Times New Roman" w:cs="Times New Roman"/>
-          <w:sz w:val="24"/>
-          <w:szCs w:val="24"/>
-        </w:rPr>
-        <w:t xml:space="preserve"> detalle la noticia ; </w:t>
-      </w:r>
-      <w:hyperlink r:id="rId6" w:history="1">
+        <w:t xml:space="preserve">portafolio operativo, permitiendo a los operadores seguir tomando posiciones masivas y destructivas en derivados financieros antes de que la gerencia detectara el fallo de control interno, en la siguiente Url podemos ver con más detalle la noticia ; </w:t>
+      </w:r>
+      <w:hyperlink r:id="rId9" w:history="1">
         <w:r>
           <w:rPr>
             <w:rStyle w:val="Hipervnculo"/>
             <w:rFonts w:ascii="Times New Roman" w:hAnsi="Times New Roman" w:cs="Times New Roman"/>
+            <w:color w:val="000000" w:themeColor="text1"/>
             <w:sz w:val="24"/>
             <w:szCs w:val="24"/>
           </w:rPr>
@@ -1027,37 +1836,24 @@
         <w:ind w:left="360"/>
         <w:rPr>
           <w:rFonts w:ascii="Times New Roman" w:hAnsi="Times New Roman" w:cs="Times New Roman"/>
-          <w:sz w:val="24"/>
-          <w:szCs w:val="24"/>
-        </w:rPr>
-      </w:pPr>
-      <w:r>
-        <w:rPr>
-          <w:rFonts w:ascii="Times New Roman" w:hAnsi="Times New Roman" w:cs="Times New Roman"/>
-          <w:sz w:val="24"/>
-          <w:szCs w:val="24"/>
-        </w:rPr>
-        <w:t>2. El caso de la hipotecaria Fannie Mae (</w:t>
-      </w:r>
-      <w:r>
-        <w:rPr>
-          <w:rFonts w:ascii="Times New Roman" w:hAnsi="Times New Roman" w:cs="Times New Roman"/>
-          <w:sz w:val="24"/>
-          <w:szCs w:val="24"/>
-        </w:rPr>
-        <w:t>2003) En</w:t>
-      </w:r>
-      <w:r>
-        <w:rPr>
-          <w:rFonts w:ascii="Times New Roman" w:hAnsi="Times New Roman" w:cs="Times New Roman"/>
-          <w:sz w:val="24"/>
-          <w:szCs w:val="24"/>
-        </w:rPr>
-        <w:t xml:space="preserve"> octubre de 2003, la gigante estadounidense de financiamiento hipotecario Fannie Mae se vio obligada a corregir públicamente sus resultados financieros del tercer trimestre debido a un error de cálculo manual detectado en una de sus hojas de cálculo corporativas. El fallo informático se originó al intentar implementar a contrarreloj una nueva y compleja norma de contabilidad para registrar compromisos de compra de viviendas y evaluarlos a precio de mercado. Un contador de la firma utilizó una fórmula equivocada en Excel, lo que provocó una distorsión que subestimó el patrimonio neto de los accionistas por 1,100 millones de dólares; la filtración inicial de este ajuste desató el pánico financiero, provocando el desplome inmediato de sus acciones en casi un 6% en la bolsa de </w:t>
-      </w:r>
-      <w:r>
-        <w:rPr>
-          <w:rFonts w:ascii="Times New Roman" w:hAnsi="Times New Roman" w:cs="Times New Roman"/>
+          <w:color w:val="000000" w:themeColor="text1"/>
+          <w:sz w:val="24"/>
+          <w:szCs w:val="24"/>
+        </w:rPr>
+      </w:pPr>
+      <w:r>
+        <w:rPr>
+          <w:rFonts w:ascii="Times New Roman" w:hAnsi="Times New Roman" w:cs="Times New Roman"/>
+          <w:color w:val="000000" w:themeColor="text1"/>
+          <w:sz w:val="24"/>
+          <w:szCs w:val="24"/>
+        </w:rPr>
+        <w:t xml:space="preserve">2. El caso de la hipotecaria Fannie Mae (2003) En octubre de 2003, la gigante estadounidense de financiamiento hipotecario Fannie Mae se vio obligada a corregir públicamente sus resultados financieros del tercer trimestre debido a un error de cálculo manual detectado en una de sus hojas de cálculo corporativas. El fallo informático se originó al intentar implementar a contrarreloj una nueva y compleja norma de contabilidad para registrar compromisos de compra de viviendas y evaluarlos a precio de mercado. Un contador de la firma utilizó una fórmula equivocada en Excel, lo que provocó una distorsión que subestimó el patrimonio neto de los accionistas por 1,100 millones de dólares; la filtración inicial de este ajuste desató el pánico financiero, provocando el desplome inmediato de sus acciones en casi un 6% en la bolsa de </w:t>
+      </w:r>
+      <w:r>
+        <w:rPr>
+          <w:rFonts w:ascii="Times New Roman" w:hAnsi="Times New Roman" w:cs="Times New Roman"/>
+          <w:color w:val="000000" w:themeColor="text1"/>
           <w:sz w:val="24"/>
           <w:szCs w:val="24"/>
         </w:rPr>
@@ -1066,6 +1862,7 @@
       <w:r>
         <w:rPr>
           <w:rFonts w:ascii="Times New Roman" w:hAnsi="Times New Roman" w:cs="Times New Roman"/>
+          <w:color w:val="000000" w:themeColor="text1"/>
           <w:sz w:val="24"/>
           <w:szCs w:val="24"/>
         </w:rPr>
@@ -1074,6 +1871,7 @@
       <w:r>
         <w:rPr>
           <w:rFonts w:ascii="Times New Roman" w:hAnsi="Times New Roman" w:cs="Times New Roman"/>
+          <w:color w:val="000000" w:themeColor="text1"/>
           <w:sz w:val="24"/>
           <w:szCs w:val="24"/>
         </w:rPr>
@@ -1082,6 +1880,7 @@
       <w:r>
         <w:rPr>
           <w:rFonts w:ascii="Times New Roman" w:hAnsi="Times New Roman" w:cs="Times New Roman"/>
+          <w:color w:val="000000" w:themeColor="text1"/>
           <w:sz w:val="24"/>
           <w:szCs w:val="24"/>
         </w:rPr>
@@ -1090,6 +1889,7 @@
       <w:r>
         <w:rPr>
           <w:rFonts w:ascii="Times New Roman" w:hAnsi="Times New Roman" w:cs="Times New Roman"/>
+          <w:color w:val="000000" w:themeColor="text1"/>
           <w:sz w:val="24"/>
           <w:szCs w:val="24"/>
         </w:rPr>
@@ -1098,6 +1898,7 @@
       <w:r>
         <w:rPr>
           <w:rFonts w:ascii="Times New Roman" w:hAnsi="Times New Roman" w:cs="Times New Roman"/>
+          <w:color w:val="000000" w:themeColor="text1"/>
           <w:sz w:val="24"/>
           <w:szCs w:val="24"/>
         </w:rPr>
@@ -1106,6 +1907,7 @@
       <w:r>
         <w:rPr>
           <w:rFonts w:ascii="Times New Roman" w:hAnsi="Times New Roman" w:cs="Times New Roman"/>
+          <w:color w:val="000000" w:themeColor="text1"/>
           <w:sz w:val="24"/>
           <w:szCs w:val="24"/>
         </w:rPr>
@@ -1114,6 +1916,7 @@
       <w:r>
         <w:rPr>
           <w:rFonts w:ascii="Times New Roman" w:hAnsi="Times New Roman" w:cs="Times New Roman"/>
+          <w:color w:val="000000" w:themeColor="text1"/>
           <w:sz w:val="24"/>
           <w:szCs w:val="24"/>
         </w:rPr>
@@ -1125,13 +1928,15 @@
         <w:ind w:left="360"/>
         <w:rPr>
           <w:rFonts w:ascii="Times New Roman" w:hAnsi="Times New Roman" w:cs="Times New Roman"/>
-          <w:sz w:val="24"/>
-          <w:szCs w:val="24"/>
-        </w:rPr>
-      </w:pPr>
-      <w:r>
-        <w:rPr>
-          <w:rFonts w:ascii="Times New Roman" w:hAnsi="Times New Roman" w:cs="Times New Roman"/>
+          <w:color w:val="000000" w:themeColor="text1"/>
+          <w:sz w:val="24"/>
+          <w:szCs w:val="24"/>
+        </w:rPr>
+      </w:pPr>
+      <w:r>
+        <w:rPr>
+          <w:rFonts w:ascii="Times New Roman" w:hAnsi="Times New Roman" w:cs="Times New Roman"/>
+          <w:color w:val="000000" w:themeColor="text1"/>
           <w:sz w:val="24"/>
           <w:szCs w:val="24"/>
         </w:rPr>
@@ -1143,13 +1948,15 @@
         <w:ind w:left="360"/>
         <w:rPr>
           <w:rFonts w:ascii="Times New Roman" w:hAnsi="Times New Roman" w:cs="Times New Roman"/>
-          <w:sz w:val="24"/>
-          <w:szCs w:val="24"/>
-        </w:rPr>
-      </w:pPr>
-      <w:r>
-        <w:rPr>
-          <w:rFonts w:ascii="Times New Roman" w:hAnsi="Times New Roman" w:cs="Times New Roman"/>
+          <w:color w:val="000000" w:themeColor="text1"/>
+          <w:sz w:val="24"/>
+          <w:szCs w:val="24"/>
+        </w:rPr>
+      </w:pPr>
+      <w:r>
+        <w:rPr>
+          <w:rFonts w:ascii="Times New Roman" w:hAnsi="Times New Roman" w:cs="Times New Roman"/>
+          <w:color w:val="000000" w:themeColor="text1"/>
           <w:sz w:val="24"/>
           <w:szCs w:val="24"/>
         </w:rPr>
@@ -1161,13 +1968,15 @@
         <w:ind w:left="360"/>
         <w:rPr>
           <w:rFonts w:ascii="Times New Roman" w:hAnsi="Times New Roman" w:cs="Times New Roman"/>
-          <w:sz w:val="24"/>
-          <w:szCs w:val="24"/>
-        </w:rPr>
-      </w:pPr>
-      <w:r>
-        <w:rPr>
-          <w:rFonts w:ascii="Times New Roman" w:hAnsi="Times New Roman" w:cs="Times New Roman"/>
+          <w:color w:val="000000" w:themeColor="text1"/>
+          <w:sz w:val="24"/>
+          <w:szCs w:val="24"/>
+        </w:rPr>
+      </w:pPr>
+      <w:r>
+        <w:rPr>
+          <w:rFonts w:ascii="Times New Roman" w:hAnsi="Times New Roman" w:cs="Times New Roman"/>
+          <w:color w:val="000000" w:themeColor="text1"/>
           <w:sz w:val="24"/>
           <w:szCs w:val="24"/>
         </w:rPr>
@@ -1179,13 +1988,15 @@
         <w:ind w:left="360"/>
         <w:rPr>
           <w:rFonts w:ascii="Times New Roman" w:hAnsi="Times New Roman" w:cs="Times New Roman"/>
-          <w:sz w:val="24"/>
-          <w:szCs w:val="24"/>
-        </w:rPr>
-      </w:pPr>
-      <w:r>
-        <w:rPr>
-          <w:rFonts w:ascii="Times New Roman" w:hAnsi="Times New Roman" w:cs="Times New Roman"/>
+          <w:color w:val="000000" w:themeColor="text1"/>
+          <w:sz w:val="24"/>
+          <w:szCs w:val="24"/>
+        </w:rPr>
+      </w:pPr>
+      <w:r>
+        <w:rPr>
+          <w:rFonts w:ascii="Times New Roman" w:hAnsi="Times New Roman" w:cs="Times New Roman"/>
+          <w:color w:val="000000" w:themeColor="text1"/>
           <w:sz w:val="24"/>
           <w:szCs w:val="24"/>
         </w:rPr>
@@ -1194,6 +2005,7 @@
       <w:r>
         <w:rPr>
           <w:rFonts w:ascii="Times New Roman" w:hAnsi="Times New Roman" w:cs="Times New Roman"/>
+          <w:color w:val="000000" w:themeColor="text1"/>
           <w:sz w:val="24"/>
           <w:szCs w:val="24"/>
         </w:rPr>
@@ -1202,6 +2014,7 @@
       <w:r>
         <w:rPr>
           <w:rFonts w:ascii="Times New Roman" w:hAnsi="Times New Roman" w:cs="Times New Roman"/>
+          <w:color w:val="000000" w:themeColor="text1"/>
           <w:sz w:val="24"/>
           <w:szCs w:val="24"/>
         </w:rPr>
@@ -1213,6 +2026,7 @@
         <w:ind w:left="360"/>
         <w:rPr>
           <w:rFonts w:ascii="Times New Roman" w:hAnsi="Times New Roman" w:cs="Times New Roman"/>
+          <w:color w:val="000000" w:themeColor="text1"/>
           <w:sz w:val="24"/>
           <w:szCs w:val="24"/>
         </w:rPr>
@@ -1223,13 +2037,15 @@
         <w:ind w:left="360"/>
         <w:rPr>
           <w:rFonts w:ascii="Times New Roman" w:hAnsi="Times New Roman" w:cs="Times New Roman"/>
-          <w:sz w:val="24"/>
-          <w:szCs w:val="24"/>
-        </w:rPr>
-      </w:pPr>
-      <w:r>
-        <w:rPr>
-          <w:rFonts w:ascii="Times New Roman" w:hAnsi="Times New Roman" w:cs="Times New Roman"/>
+          <w:color w:val="000000" w:themeColor="text1"/>
+          <w:sz w:val="24"/>
+          <w:szCs w:val="24"/>
+        </w:rPr>
+      </w:pPr>
+      <w:r>
+        <w:rPr>
+          <w:rFonts w:ascii="Times New Roman" w:hAnsi="Times New Roman" w:cs="Times New Roman"/>
+          <w:color w:val="000000" w:themeColor="text1"/>
           <w:sz w:val="24"/>
           <w:szCs w:val="24"/>
         </w:rPr>
@@ -1242,13 +2058,15 @@
         <w:ind w:left="360"/>
         <w:rPr>
           <w:rFonts w:ascii="Times New Roman" w:hAnsi="Times New Roman" w:cs="Times New Roman"/>
-          <w:sz w:val="24"/>
-          <w:szCs w:val="24"/>
-        </w:rPr>
-      </w:pPr>
-      <w:r>
-        <w:rPr>
-          <w:rFonts w:ascii="Times New Roman" w:hAnsi="Times New Roman" w:cs="Times New Roman"/>
+          <w:color w:val="000000" w:themeColor="text1"/>
+          <w:sz w:val="24"/>
+          <w:szCs w:val="24"/>
+        </w:rPr>
+      </w:pPr>
+      <w:r>
+        <w:rPr>
+          <w:rFonts w:ascii="Times New Roman" w:hAnsi="Times New Roman" w:cs="Times New Roman"/>
+          <w:color w:val="000000" w:themeColor="text1"/>
           <w:sz w:val="24"/>
           <w:szCs w:val="24"/>
         </w:rPr>
@@ -1260,15 +2078,17 @@
         <w:ind w:left="360"/>
         <w:rPr>
           <w:rFonts w:ascii="Times New Roman" w:hAnsi="Times New Roman" w:cs="Times New Roman"/>
-          <w:sz w:val="24"/>
-          <w:szCs w:val="24"/>
-        </w:rPr>
-      </w:pPr>
-      <w:hyperlink r:id="rId7" w:history="1">
+          <w:color w:val="000000" w:themeColor="text1"/>
+          <w:sz w:val="24"/>
+          <w:szCs w:val="24"/>
+        </w:rPr>
+      </w:pPr>
+      <w:hyperlink r:id="rId10" w:history="1">
         <w:r>
           <w:rPr>
             <w:rStyle w:val="Hipervnculo"/>
             <w:rFonts w:ascii="Times New Roman" w:hAnsi="Times New Roman" w:cs="Times New Roman"/>
+            <w:color w:val="000000" w:themeColor="text1"/>
             <w:sz w:val="24"/>
             <w:szCs w:val="24"/>
           </w:rPr>
@@ -1281,33 +2101,19 @@
         <w:ind w:left="360"/>
         <w:rPr>
           <w:rFonts w:ascii="Times New Roman" w:hAnsi="Times New Roman" w:cs="Times New Roman"/>
-          <w:sz w:val="24"/>
-          <w:szCs w:val="24"/>
-        </w:rPr>
-      </w:pPr>
-      <w:r>
-        <w:rPr>
-          <w:rFonts w:ascii="Times New Roman" w:hAnsi="Times New Roman" w:cs="Times New Roman"/>
-          <w:sz w:val="24"/>
-          <w:szCs w:val="24"/>
-        </w:rPr>
-        <w:t xml:space="preserve">Control estricto y auditoría del presupuesto de las alcaldías locales (Caso </w:t>
-      </w:r>
-      <w:r>
-        <w:rPr>
-          <w:rFonts w:ascii="Times New Roman" w:hAnsi="Times New Roman" w:cs="Times New Roman"/>
-          <w:sz w:val="24"/>
-          <w:szCs w:val="24"/>
-        </w:rPr>
-        <w:t>6) Como</w:t>
-      </w:r>
-      <w:r>
-        <w:rPr>
-          <w:rFonts w:ascii="Times New Roman" w:hAnsi="Times New Roman" w:cs="Times New Roman"/>
-          <w:sz w:val="24"/>
-          <w:szCs w:val="24"/>
-        </w:rPr>
-        <w:t xml:space="preserve"> una medida radical para frenar las ineficiencias de los presupuestos inerciales y eliminar los riesgos de malversación hormiga en los municipios del país, el Poder Ejecutivo retiró la autonomía financiera que gestionaban de forma descentralizada las 153 alcaldías de Nicaragua. Bajo el nuevo esquema, todas las finanzas públicas municipales, los procesos de contrataciones, las planillas y las asignaciones de fondos para proyectos locales pasaron a estar bajo el control administrativo de la Procuraduría General de la República (PGR). Esta reestructuración obliga a que cada partida de gasto se valide y autorice de manera preventiva a través de una base de datos centralizada de fiscalización, impidiendo que los gobiernos locales ejecuten fondos de manera discrecional o sin una justificación de costo real.</w:t>
+          <w:color w:val="000000" w:themeColor="text1"/>
+          <w:sz w:val="24"/>
+          <w:szCs w:val="24"/>
+        </w:rPr>
+      </w:pPr>
+      <w:r>
+        <w:rPr>
+          <w:rFonts w:ascii="Times New Roman" w:hAnsi="Times New Roman" w:cs="Times New Roman"/>
+          <w:color w:val="000000" w:themeColor="text1"/>
+          <w:sz w:val="24"/>
+          <w:szCs w:val="24"/>
+        </w:rPr>
+        <w:t>Control estricto y auditoría del presupuesto de las alcaldías locales (Caso 6) Como una medida radical para frenar las ineficiencias de los presupuestos inerciales y eliminar los riesgos de malversación hormiga en los municipios del país, el Poder Ejecutivo retiró la autonomía financiera que gestionaban de forma descentralizada las 153 alcaldías de Nicaragua. Bajo el nuevo esquema, todas las finanzas públicas municipales, los procesos de contrataciones, las planillas y las asignaciones de fondos para proyectos locales pasaron a estar bajo el control administrativo de la Procuraduría General de la República (PGR). Esta reestructuración obliga a que cada partida de gasto se valide y autorice de manera preventiva a través de una base de datos centralizada de fiscalización, impidiendo que los gobiernos locales ejecuten fondos de manera discrecional o sin una justificación de costo real.</w:t>
       </w:r>
     </w:p>
     <w:p>
@@ -1315,15 +2121,17 @@
         <w:ind w:left="360"/>
         <w:rPr>
           <w:rFonts w:ascii="Times New Roman" w:hAnsi="Times New Roman" w:cs="Times New Roman"/>
-          <w:sz w:val="24"/>
-          <w:szCs w:val="24"/>
-        </w:rPr>
-      </w:pPr>
-      <w:hyperlink r:id="rId8" w:history="1">
+          <w:color w:val="000000" w:themeColor="text1"/>
+          <w:sz w:val="24"/>
+          <w:szCs w:val="24"/>
+        </w:rPr>
+      </w:pPr>
+      <w:hyperlink r:id="rId11" w:history="1">
         <w:r>
           <w:rPr>
             <w:rStyle w:val="Hipervnculo"/>
             <w:rFonts w:ascii="Times New Roman" w:hAnsi="Times New Roman" w:cs="Times New Roman"/>
+            <w:color w:val="000000" w:themeColor="text1"/>
             <w:sz w:val="24"/>
             <w:szCs w:val="24"/>
           </w:rPr>
@@ -1336,6 +2144,7 @@
         <w:ind w:left="360"/>
         <w:rPr>
           <w:rFonts w:ascii="Times New Roman" w:hAnsi="Times New Roman" w:cs="Times New Roman"/>
+          <w:color w:val="000000" w:themeColor="text1"/>
           <w:sz w:val="24"/>
           <w:szCs w:val="24"/>
         </w:rPr>
@@ -1346,22 +2155,25 @@
         <w:ind w:left="360"/>
         <w:rPr>
           <w:rFonts w:ascii="Times New Roman" w:hAnsi="Times New Roman" w:cs="Times New Roman"/>
-          <w:sz w:val="24"/>
-          <w:szCs w:val="24"/>
-        </w:rPr>
-      </w:pPr>
-    </w:p>
-    <w:p>
-      <w:pPr>
-        <w:rPr>
-          <w:rFonts w:ascii="Times New Roman" w:hAnsi="Times New Roman" w:cs="Times New Roman"/>
-          <w:sz w:val="24"/>
-          <w:szCs w:val="24"/>
-        </w:rPr>
-      </w:pPr>
-      <w:r>
-        <w:rPr>
-          <w:rFonts w:ascii="Times New Roman" w:hAnsi="Times New Roman" w:cs="Times New Roman"/>
+          <w:color w:val="000000" w:themeColor="text1"/>
+          <w:sz w:val="24"/>
+          <w:szCs w:val="24"/>
+        </w:rPr>
+      </w:pPr>
+    </w:p>
+    <w:p>
+      <w:pPr>
+        <w:rPr>
+          <w:rFonts w:ascii="Times New Roman" w:hAnsi="Times New Roman" w:cs="Times New Roman"/>
+          <w:color w:val="000000" w:themeColor="text1"/>
+          <w:sz w:val="24"/>
+          <w:szCs w:val="24"/>
+        </w:rPr>
+      </w:pPr>
+      <w:r>
+        <w:rPr>
+          <w:rFonts w:ascii="Times New Roman" w:hAnsi="Times New Roman" w:cs="Times New Roman"/>
+          <w:color w:val="000000" w:themeColor="text1"/>
           <w:sz w:val="24"/>
           <w:szCs w:val="24"/>
         </w:rPr>
@@ -1370,39 +2182,35 @@
     </w:p>
     <w:p>
       <w:pPr>
-        <w:ind w:left="360"/>
-        <w:rPr>
-          <w:rFonts w:ascii="Times New Roman" w:hAnsi="Times New Roman" w:cs="Times New Roman"/>
-          <w:b/>
-          <w:bCs/>
-          <w:sz w:val="24"/>
-          <w:szCs w:val="24"/>
-        </w:rPr>
-      </w:pPr>
-      <w:r>
-        <w:rPr>
-          <w:rFonts w:ascii="Times New Roman" w:hAnsi="Times New Roman" w:cs="Times New Roman"/>
-          <w:b/>
-          <w:bCs/>
-          <w:sz w:val="24"/>
-          <w:szCs w:val="24"/>
+        <w:pStyle w:val="Ttulo1"/>
+        <w:rPr>
+          <w:color w:val="000000" w:themeColor="text1"/>
+        </w:rPr>
+      </w:pPr>
+      <w:bookmarkStart w:id="4" w:name="_Toc231651126"/>
+      <w:r>
+        <w:rPr>
+          <w:color w:val="000000" w:themeColor="text1"/>
         </w:rPr>
         <w:lastRenderedPageBreak/>
         <w:t>Pregunta de Investigación</w:t>
       </w:r>
+      <w:bookmarkEnd w:id="4"/>
     </w:p>
     <w:p>
       <w:pPr>
         <w:ind w:left="360"/>
         <w:rPr>
           <w:rFonts w:ascii="Times New Roman" w:hAnsi="Times New Roman" w:cs="Times New Roman"/>
-          <w:sz w:val="24"/>
-          <w:szCs w:val="24"/>
-        </w:rPr>
-      </w:pPr>
-      <w:r>
-        <w:rPr>
-          <w:rFonts w:ascii="Times New Roman" w:hAnsi="Times New Roman" w:cs="Times New Roman"/>
+          <w:color w:val="000000" w:themeColor="text1"/>
+          <w:sz w:val="24"/>
+          <w:szCs w:val="24"/>
+        </w:rPr>
+      </w:pPr>
+      <w:r>
+        <w:rPr>
+          <w:rFonts w:ascii="Times New Roman" w:hAnsi="Times New Roman" w:cs="Times New Roman"/>
+          <w:color w:val="000000" w:themeColor="text1"/>
           <w:sz w:val="24"/>
           <w:szCs w:val="24"/>
         </w:rPr>
@@ -1414,22 +2222,25 @@
         <w:ind w:left="360"/>
         <w:rPr>
           <w:rFonts w:ascii="Times New Roman" w:hAnsi="Times New Roman" w:cs="Times New Roman"/>
-          <w:sz w:val="24"/>
-          <w:szCs w:val="24"/>
-        </w:rPr>
-      </w:pPr>
-    </w:p>
-    <w:p>
-      <w:pPr>
-        <w:rPr>
-          <w:rFonts w:ascii="Times New Roman" w:hAnsi="Times New Roman" w:cs="Times New Roman"/>
-          <w:sz w:val="24"/>
-          <w:szCs w:val="24"/>
-        </w:rPr>
-      </w:pPr>
-      <w:r>
-        <w:rPr>
-          <w:rFonts w:ascii="Times New Roman" w:hAnsi="Times New Roman" w:cs="Times New Roman"/>
+          <w:color w:val="000000" w:themeColor="text1"/>
+          <w:sz w:val="24"/>
+          <w:szCs w:val="24"/>
+        </w:rPr>
+      </w:pPr>
+    </w:p>
+    <w:p>
+      <w:pPr>
+        <w:rPr>
+          <w:rFonts w:ascii="Times New Roman" w:hAnsi="Times New Roman" w:cs="Times New Roman"/>
+          <w:color w:val="000000" w:themeColor="text1"/>
+          <w:sz w:val="24"/>
+          <w:szCs w:val="24"/>
+        </w:rPr>
+      </w:pPr>
+      <w:r>
+        <w:rPr>
+          <w:rFonts w:ascii="Times New Roman" w:hAnsi="Times New Roman" w:cs="Times New Roman"/>
+          <w:color w:val="000000" w:themeColor="text1"/>
           <w:sz w:val="24"/>
           <w:szCs w:val="24"/>
         </w:rPr>
@@ -1438,51 +2249,39 @@
     </w:p>
     <w:p>
       <w:pPr>
-        <w:ind w:left="360"/>
-        <w:rPr>
-          <w:rFonts w:ascii="Times New Roman" w:hAnsi="Times New Roman" w:cs="Times New Roman"/>
-          <w:b/>
-          <w:bCs/>
-          <w:sz w:val="24"/>
-          <w:szCs w:val="24"/>
-        </w:rPr>
-      </w:pPr>
-      <w:r>
-        <w:rPr>
-          <w:rFonts w:ascii="Times New Roman" w:hAnsi="Times New Roman" w:cs="Times New Roman"/>
-          <w:b/>
-          <w:bCs/>
-          <w:sz w:val="24"/>
-          <w:szCs w:val="24"/>
+        <w:pStyle w:val="Ttulo1"/>
+        <w:rPr>
+          <w:color w:val="000000" w:themeColor="text1"/>
+        </w:rPr>
+      </w:pPr>
+      <w:bookmarkStart w:id="5" w:name="_Toc231651127"/>
+      <w:r>
+        <w:rPr>
+          <w:color w:val="000000" w:themeColor="text1"/>
         </w:rPr>
         <w:lastRenderedPageBreak/>
         <w:t>Objetivo General:</w:t>
       </w:r>
+      <w:bookmarkEnd w:id="5"/>
     </w:p>
     <w:p>
       <w:pPr>
         <w:ind w:left="360"/>
         <w:rPr>
           <w:rFonts w:ascii="Times New Roman" w:hAnsi="Times New Roman" w:cs="Times New Roman"/>
-          <w:sz w:val="24"/>
-          <w:szCs w:val="24"/>
-        </w:rPr>
-      </w:pPr>
-      <w:r>
-        <w:rPr>
-          <w:rFonts w:ascii="Times New Roman" w:hAnsi="Times New Roman" w:cs="Times New Roman"/>
-          <w:sz w:val="24"/>
-          <w:szCs w:val="24"/>
-        </w:rPr>
-        <w:t>Desarrollar un sistema automatizado de control y seguimiento presupuestario mensual, mediante la centralización de flujos financieros y la configuración de alertas de consumo</w:t>
-      </w:r>
-      <w:r>
-        <w:rPr>
-          <w:rFonts w:ascii="Times New Roman" w:hAnsi="Times New Roman" w:cs="Times New Roman"/>
-          <w:sz w:val="24"/>
-          <w:szCs w:val="24"/>
-        </w:rPr>
-        <w:t>.</w:t>
+          <w:color w:val="000000" w:themeColor="text1"/>
+          <w:sz w:val="24"/>
+          <w:szCs w:val="24"/>
+        </w:rPr>
+      </w:pPr>
+      <w:r>
+        <w:rPr>
+          <w:rFonts w:ascii="Times New Roman" w:hAnsi="Times New Roman" w:cs="Times New Roman"/>
+          <w:color w:val="000000" w:themeColor="text1"/>
+          <w:sz w:val="24"/>
+          <w:szCs w:val="24"/>
+        </w:rPr>
+        <w:t>Desarrollar un sistema automatizado de control y seguimiento presupuestario mensual, mediante la centralización de flujos financieros y la configuración de alertas de consumo.</w:t>
       </w:r>
     </w:p>
     <w:p>
@@ -1490,32 +2289,27 @@
         <w:ind w:left="360"/>
         <w:rPr>
           <w:rFonts w:ascii="Times New Roman" w:hAnsi="Times New Roman" w:cs="Times New Roman"/>
-          <w:sz w:val="24"/>
-          <w:szCs w:val="24"/>
-        </w:rPr>
-      </w:pPr>
-    </w:p>
-    <w:p>
-      <w:pPr>
-        <w:ind w:left="360"/>
-        <w:rPr>
-          <w:rFonts w:ascii="Times New Roman" w:hAnsi="Times New Roman" w:cs="Times New Roman"/>
-          <w:b/>
-          <w:bCs/>
-          <w:sz w:val="24"/>
-          <w:szCs w:val="24"/>
-        </w:rPr>
-      </w:pPr>
-      <w:r>
-        <w:rPr>
-          <w:rFonts w:ascii="Times New Roman" w:hAnsi="Times New Roman" w:cs="Times New Roman"/>
-          <w:b/>
-          <w:bCs/>
-          <w:sz w:val="24"/>
-          <w:szCs w:val="24"/>
+          <w:color w:val="000000" w:themeColor="text1"/>
+          <w:sz w:val="24"/>
+          <w:szCs w:val="24"/>
+        </w:rPr>
+      </w:pPr>
+    </w:p>
+    <w:p>
+      <w:pPr>
+        <w:pStyle w:val="Ttulo1"/>
+        <w:rPr>
+          <w:color w:val="000000" w:themeColor="text1"/>
+        </w:rPr>
+      </w:pPr>
+      <w:bookmarkStart w:id="6" w:name="_Toc231651128"/>
+      <w:r>
+        <w:rPr>
+          <w:color w:val="000000" w:themeColor="text1"/>
         </w:rPr>
         <w:t>Objetivo Especifico:</w:t>
       </w:r>
+      <w:bookmarkEnd w:id="6"/>
     </w:p>
     <w:p>
       <w:pPr>
@@ -1526,49 +2320,19 @@
         </w:numPr>
         <w:rPr>
           <w:rFonts w:ascii="Times New Roman" w:hAnsi="Times New Roman" w:cs="Times New Roman"/>
-          <w:sz w:val="24"/>
-          <w:szCs w:val="24"/>
-        </w:rPr>
-      </w:pPr>
-      <w:r>
-        <w:rPr>
-          <w:rFonts w:ascii="Times New Roman" w:hAnsi="Times New Roman" w:cs="Times New Roman"/>
-          <w:sz w:val="24"/>
-          <w:szCs w:val="24"/>
-        </w:rPr>
-        <w:t>I</w:t>
-      </w:r>
-      <w:r>
-        <w:rPr>
-          <w:rFonts w:ascii="Times New Roman" w:hAnsi="Times New Roman" w:cs="Times New Roman"/>
-          <w:sz w:val="24"/>
-          <w:szCs w:val="24"/>
-        </w:rPr>
-        <w:t>dentificar</w:t>
-      </w:r>
-      <w:r>
-        <w:rPr>
-          <w:rFonts w:ascii="Times New Roman" w:hAnsi="Times New Roman" w:cs="Times New Roman"/>
-          <w:sz w:val="24"/>
-          <w:szCs w:val="24"/>
-        </w:rPr>
-        <w:t xml:space="preserve"> </w:t>
-      </w:r>
-      <w:r>
-        <w:rPr>
-          <w:rFonts w:ascii="Times New Roman" w:hAnsi="Times New Roman" w:cs="Times New Roman"/>
-          <w:sz w:val="24"/>
-          <w:szCs w:val="24"/>
-        </w:rPr>
-        <w:t xml:space="preserve">las necesidades financieras, las categorías de gastos y la estructura de los centros de costo de la </w:t>
-      </w:r>
-      <w:r>
-        <w:rPr>
-          <w:rFonts w:ascii="Times New Roman" w:hAnsi="Times New Roman" w:cs="Times New Roman"/>
-          <w:sz w:val="24"/>
-          <w:szCs w:val="24"/>
-        </w:rPr>
-        <w:t>Empresa.</w:t>
+          <w:color w:val="000000" w:themeColor="text1"/>
+          <w:sz w:val="24"/>
+          <w:szCs w:val="24"/>
+        </w:rPr>
+      </w:pPr>
+      <w:r>
+        <w:rPr>
+          <w:rFonts w:ascii="Times New Roman" w:hAnsi="Times New Roman" w:cs="Times New Roman"/>
+          <w:color w:val="000000" w:themeColor="text1"/>
+          <w:sz w:val="24"/>
+          <w:szCs w:val="24"/>
+        </w:rPr>
+        <w:t>Identificar las necesidades financieras, las categorías de gastos y la estructura de los centros de costo de la Empresa.</w:t>
       </w:r>
     </w:p>
     <w:p>
@@ -1580,25 +2344,19 @@
         </w:numPr>
         <w:rPr>
           <w:rFonts w:ascii="Times New Roman" w:hAnsi="Times New Roman" w:cs="Times New Roman"/>
-          <w:sz w:val="24"/>
-          <w:szCs w:val="24"/>
-        </w:rPr>
-      </w:pPr>
-      <w:r>
-        <w:rPr>
-          <w:rFonts w:ascii="Times New Roman" w:hAnsi="Times New Roman" w:cs="Times New Roman"/>
-          <w:sz w:val="24"/>
-          <w:szCs w:val="24"/>
-        </w:rPr>
-        <w:t>Diseñar una arquitectura de datos robusta y un flujo automatizado de aprobaciones que permita registrar, clasificar y autorizar las transacciones económicas de forma segura</w:t>
-      </w:r>
-      <w:r>
-        <w:rPr>
-          <w:rFonts w:ascii="Times New Roman" w:hAnsi="Times New Roman" w:cs="Times New Roman"/>
-          <w:sz w:val="24"/>
-          <w:szCs w:val="24"/>
-        </w:rPr>
-        <w:t xml:space="preserve"> de la empresa.</w:t>
+          <w:color w:val="000000" w:themeColor="text1"/>
+          <w:sz w:val="24"/>
+          <w:szCs w:val="24"/>
+        </w:rPr>
+      </w:pPr>
+      <w:r>
+        <w:rPr>
+          <w:rFonts w:ascii="Times New Roman" w:hAnsi="Times New Roman" w:cs="Times New Roman"/>
+          <w:color w:val="000000" w:themeColor="text1"/>
+          <w:sz w:val="24"/>
+          <w:szCs w:val="24"/>
+        </w:rPr>
+        <w:t>Diseñar una arquitectura de datos robusta y un flujo automatizado de aprobaciones que permita registrar, clasificar y autorizar las transacciones económicas de forma segura de la empresa.</w:t>
       </w:r>
     </w:p>
     <w:p>
@@ -1610,25 +2368,19 @@
         </w:numPr>
         <w:rPr>
           <w:rFonts w:ascii="Times New Roman" w:hAnsi="Times New Roman" w:cs="Times New Roman"/>
-          <w:sz w:val="24"/>
-          <w:szCs w:val="24"/>
-        </w:rPr>
-      </w:pPr>
-      <w:r>
-        <w:rPr>
-          <w:rFonts w:ascii="Times New Roman" w:hAnsi="Times New Roman" w:cs="Times New Roman"/>
-          <w:sz w:val="24"/>
-          <w:szCs w:val="24"/>
-        </w:rPr>
-        <w:t>Desarrollar un módulo de reportería analítica y alertas tempranas de desviaciones presupuestarias</w:t>
-      </w:r>
-      <w:r>
-        <w:rPr>
-          <w:rFonts w:ascii="Times New Roman" w:hAnsi="Times New Roman" w:cs="Times New Roman"/>
-          <w:sz w:val="24"/>
-          <w:szCs w:val="24"/>
-        </w:rPr>
-        <w:t xml:space="preserve"> de la empresa.</w:t>
+          <w:color w:val="000000" w:themeColor="text1"/>
+          <w:sz w:val="24"/>
+          <w:szCs w:val="24"/>
+        </w:rPr>
+      </w:pPr>
+      <w:r>
+        <w:rPr>
+          <w:rFonts w:ascii="Times New Roman" w:hAnsi="Times New Roman" w:cs="Times New Roman"/>
+          <w:color w:val="000000" w:themeColor="text1"/>
+          <w:sz w:val="24"/>
+          <w:szCs w:val="24"/>
+        </w:rPr>
+        <w:t>Desarrollar un módulo de reportería analítica y alertas tempranas de desviaciones presupuestarias de la empresa.</w:t>
       </w:r>
     </w:p>
     <w:p>
@@ -1637,31 +2389,35 @@
         <w:ind w:left="1080"/>
         <w:rPr>
           <w:rFonts w:ascii="Times New Roman" w:hAnsi="Times New Roman" w:cs="Times New Roman"/>
-          <w:sz w:val="24"/>
-          <w:szCs w:val="24"/>
-        </w:rPr>
-      </w:pPr>
-    </w:p>
-    <w:p>
-      <w:pPr>
-        <w:rPr>
-          <w:rFonts w:ascii="Times New Roman" w:hAnsi="Times New Roman" w:cs="Times New Roman"/>
-          <w:sz w:val="24"/>
-          <w:szCs w:val="24"/>
-        </w:rPr>
-      </w:pPr>
-    </w:p>
-    <w:p>
-      <w:pPr>
-        <w:rPr>
-          <w:rFonts w:ascii="Times New Roman" w:hAnsi="Times New Roman" w:cs="Times New Roman"/>
-          <w:sz w:val="24"/>
-          <w:szCs w:val="24"/>
-        </w:rPr>
-      </w:pPr>
-      <w:r>
-        <w:rPr>
-          <w:rFonts w:ascii="Times New Roman" w:hAnsi="Times New Roman" w:cs="Times New Roman"/>
+          <w:color w:val="000000" w:themeColor="text1"/>
+          <w:sz w:val="24"/>
+          <w:szCs w:val="24"/>
+        </w:rPr>
+      </w:pPr>
+    </w:p>
+    <w:p>
+      <w:pPr>
+        <w:rPr>
+          <w:rFonts w:ascii="Times New Roman" w:hAnsi="Times New Roman" w:cs="Times New Roman"/>
+          <w:color w:val="000000" w:themeColor="text1"/>
+          <w:sz w:val="24"/>
+          <w:szCs w:val="24"/>
+        </w:rPr>
+      </w:pPr>
+    </w:p>
+    <w:p>
+      <w:pPr>
+        <w:rPr>
+          <w:rFonts w:ascii="Times New Roman" w:hAnsi="Times New Roman" w:cs="Times New Roman"/>
+          <w:color w:val="000000" w:themeColor="text1"/>
+          <w:sz w:val="24"/>
+          <w:szCs w:val="24"/>
+        </w:rPr>
+      </w:pPr>
+      <w:r>
+        <w:rPr>
+          <w:rFonts w:ascii="Times New Roman" w:hAnsi="Times New Roman" w:cs="Times New Roman"/>
+          <w:color w:val="000000" w:themeColor="text1"/>
           <w:sz w:val="24"/>
           <w:szCs w:val="24"/>
         </w:rPr>
@@ -1670,98 +2426,64 @@
     </w:p>
     <w:p>
       <w:pPr>
-        <w:rPr>
-          <w:rFonts w:ascii="Times New Roman" w:hAnsi="Times New Roman" w:cs="Times New Roman"/>
-          <w:b/>
-          <w:bCs/>
-          <w:sz w:val="24"/>
-          <w:szCs w:val="24"/>
-        </w:rPr>
-      </w:pPr>
-      <w:r>
-        <w:rPr>
-          <w:rFonts w:ascii="Times New Roman" w:hAnsi="Times New Roman" w:cs="Times New Roman"/>
-          <w:b/>
-          <w:bCs/>
-          <w:sz w:val="24"/>
-          <w:szCs w:val="24"/>
+        <w:pStyle w:val="Ttulo1"/>
+        <w:rPr>
+          <w:color w:val="000000" w:themeColor="text1"/>
+        </w:rPr>
+      </w:pPr>
+      <w:bookmarkStart w:id="7" w:name="_Toc231651129"/>
+      <w:r>
+        <w:rPr>
+          <w:color w:val="000000" w:themeColor="text1"/>
         </w:rPr>
         <w:lastRenderedPageBreak/>
-        <w:t>Justificación</w:t>
-      </w:r>
-      <w:r>
-        <w:rPr>
-          <w:rFonts w:ascii="Times New Roman" w:hAnsi="Times New Roman" w:cs="Times New Roman"/>
-          <w:b/>
-          <w:bCs/>
-          <w:sz w:val="24"/>
-          <w:szCs w:val="24"/>
-        </w:rPr>
-        <w:t>:</w:t>
-      </w:r>
-    </w:p>
-    <w:p>
-      <w:pPr>
-        <w:rPr>
-          <w:rFonts w:ascii="Times New Roman" w:hAnsi="Times New Roman" w:cs="Times New Roman"/>
-          <w:sz w:val="24"/>
-          <w:szCs w:val="24"/>
-        </w:rPr>
-      </w:pPr>
-      <w:r>
-        <w:rPr>
-          <w:rFonts w:ascii="Times New Roman" w:hAnsi="Times New Roman" w:cs="Times New Roman"/>
-          <w:sz w:val="24"/>
-          <w:szCs w:val="24"/>
-        </w:rPr>
-        <w:t>La planificación, ejecución y control de los recursos financieros representa uno de los desafíos más críticos para la supervivencia y competitividad de cualquier organización en el mercado contemporáneo. Históricamente, la gestión presupuestaria ha adolecido de vulnerabilidades estructurales debido a las herramientas utilizadas para su administración. La presente investigación y el consecuente desarrollo del sistema automatizado de presupuesto empresarial se justifican plenamente desde tres perspectivas fundamentales</w:t>
-      </w:r>
-      <w:r>
-        <w:rPr>
-          <w:rFonts w:ascii="Times New Roman" w:hAnsi="Times New Roman" w:cs="Times New Roman"/>
-          <w:sz w:val="24"/>
-          <w:szCs w:val="24"/>
-        </w:rPr>
-        <w:t>,</w:t>
-      </w:r>
-      <w:r>
-        <w:rPr>
-          <w:rFonts w:ascii="Times New Roman" w:hAnsi="Times New Roman" w:cs="Times New Roman"/>
-          <w:sz w:val="24"/>
-          <w:szCs w:val="24"/>
-        </w:rPr>
-        <w:t xml:space="preserve"> técnica, operativa y de control de riesgos financieros.</w:t>
-      </w:r>
-    </w:p>
-    <w:p>
-      <w:pPr>
-        <w:rPr>
-          <w:rFonts w:ascii="Times New Roman" w:hAnsi="Times New Roman" w:cs="Times New Roman"/>
-          <w:sz w:val="24"/>
-          <w:szCs w:val="24"/>
-        </w:rPr>
-      </w:pPr>
-      <w:r>
-        <w:rPr>
-          <w:rFonts w:ascii="Times New Roman" w:hAnsi="Times New Roman" w:cs="Times New Roman"/>
-          <w:sz w:val="24"/>
-          <w:szCs w:val="24"/>
-        </w:rPr>
-        <w:t>Desde una perspectiva técnica, el desarrollo de este software responde a la urgente necesidad de migrar de esquemas de control reactivos hacia sistemas preventivos centralizados. El enfoque tradicional basado en libros contables físicos heredó al mundo empresarial el "enemigo del retraso", donde los tomadores de decisiones conocían los descalces financieros semanas después de haber ocurrido el impacto</w:t>
-      </w:r>
-      <w:r>
-        <w:rPr>
-          <w:rFonts w:ascii="Times New Roman" w:hAnsi="Times New Roman" w:cs="Times New Roman"/>
-          <w:sz w:val="24"/>
-          <w:szCs w:val="24"/>
-        </w:rPr>
-        <w:t>.</w:t>
-      </w:r>
-    </w:p>
-    <w:p>
-      <w:pPr>
-        <w:rPr>
-          <w:rFonts w:ascii="Times New Roman" w:hAnsi="Times New Roman" w:cs="Times New Roman"/>
+        <w:t>Justificación:</w:t>
+      </w:r>
+      <w:bookmarkEnd w:id="7"/>
+    </w:p>
+    <w:p>
+      <w:pPr>
+        <w:rPr>
+          <w:rFonts w:ascii="Times New Roman" w:hAnsi="Times New Roman" w:cs="Times New Roman"/>
+          <w:color w:val="000000" w:themeColor="text1"/>
+          <w:sz w:val="24"/>
+          <w:szCs w:val="24"/>
+        </w:rPr>
+      </w:pPr>
+      <w:r>
+        <w:rPr>
+          <w:rFonts w:ascii="Times New Roman" w:hAnsi="Times New Roman" w:cs="Times New Roman"/>
+          <w:color w:val="000000" w:themeColor="text1"/>
+          <w:sz w:val="24"/>
+          <w:szCs w:val="24"/>
+        </w:rPr>
+        <w:t>La planificación, ejecución y control de los recursos financieros representa uno de los desafíos más críticos para la supervivencia y competitividad de cualquier organización en el mercado contemporáneo. Históricamente, la gestión presupuestaria ha adolecido de vulnerabilidades estructurales debido a las herramientas utilizadas para su administración. La presente investigación y el consecuente desarrollo del sistema automatizado de presupuesto empresarial se justifican plenamente desde tres perspectivas fundamentales, técnica, operativa y de control de riesgos financieros.</w:t>
+      </w:r>
+    </w:p>
+    <w:p>
+      <w:pPr>
+        <w:rPr>
+          <w:rFonts w:ascii="Times New Roman" w:hAnsi="Times New Roman" w:cs="Times New Roman"/>
+          <w:color w:val="000000" w:themeColor="text1"/>
+          <w:sz w:val="24"/>
+          <w:szCs w:val="24"/>
+        </w:rPr>
+      </w:pPr>
+      <w:r>
+        <w:rPr>
+          <w:rFonts w:ascii="Times New Roman" w:hAnsi="Times New Roman" w:cs="Times New Roman"/>
+          <w:color w:val="000000" w:themeColor="text1"/>
+          <w:sz w:val="24"/>
+          <w:szCs w:val="24"/>
+        </w:rPr>
+        <w:t>Desde una perspectiva técnica, el desarrollo de este software responde a la urgente necesidad de migrar de esquemas de control reactivos hacia sistemas preventivos centralizados. El enfoque tradicional basado en libros contables físicos heredó al mundo empresarial el "enemigo del retraso", donde los tomadores de decisiones conocían los descalces financieros semanas después de haber ocurrido el impacto.</w:t>
+      </w:r>
+    </w:p>
+    <w:p>
+      <w:pPr>
+        <w:rPr>
+          <w:rFonts w:ascii="Times New Roman" w:hAnsi="Times New Roman" w:cs="Times New Roman"/>
+          <w:color w:val="000000" w:themeColor="text1"/>
           <w:sz w:val="24"/>
           <w:szCs w:val="24"/>
           <w:lang w:val="es-NI"/>
@@ -1770,97 +2492,28 @@
       <w:r>
         <w:rPr>
           <w:rFonts w:ascii="Times New Roman" w:hAnsi="Times New Roman" w:cs="Times New Roman"/>
+          <w:color w:val="000000" w:themeColor="text1"/>
           <w:sz w:val="24"/>
           <w:szCs w:val="24"/>
           <w:lang w:val="es-NI"/>
         </w:rPr>
-        <w:t>Este proyecto se justifica técnicamente al proveer una arquitectura de datos unificada, donde se implementan conceptos avanzados de la evolución industrial como</w:t>
-      </w:r>
-      <w:r>
-        <w:rPr>
-          <w:rFonts w:ascii="Times New Roman" w:hAnsi="Times New Roman" w:cs="Times New Roman"/>
+        <w:t>Este proyecto se justifica técnicamente al proveer una arquitectura de datos unificada, donde se implementan conceptos avanzados de la evolución industrial como. El presupuesto base cero Obligando a auditar y justificar cada partida desde su origen. El linaje de datos. Garantizando una trazabilidad cronológica inalterable de cada transacción.</w:t>
+      </w:r>
+    </w:p>
+    <w:p>
+      <w:pPr>
+        <w:rPr>
+          <w:rFonts w:ascii="Times New Roman" w:hAnsi="Times New Roman" w:cs="Times New Roman"/>
+          <w:color w:val="000000" w:themeColor="text1"/>
           <w:sz w:val="24"/>
           <w:szCs w:val="24"/>
           <w:lang w:val="es-NI"/>
         </w:rPr>
-        <w:t xml:space="preserve">. </w:t>
-      </w:r>
-      <w:r>
-        <w:rPr>
-          <w:rFonts w:ascii="Times New Roman" w:hAnsi="Times New Roman" w:cs="Times New Roman"/>
-          <w:sz w:val="24"/>
-          <w:szCs w:val="24"/>
-          <w:lang w:val="es-NI"/>
-        </w:rPr>
-        <w:t>El presupuesto base cero</w:t>
-      </w:r>
-      <w:r>
-        <w:rPr>
-          <w:rFonts w:ascii="Times New Roman" w:hAnsi="Times New Roman" w:cs="Times New Roman"/>
-          <w:sz w:val="24"/>
-          <w:szCs w:val="24"/>
-          <w:lang w:val="es-NI"/>
-        </w:rPr>
-        <w:t xml:space="preserve"> </w:t>
-      </w:r>
-      <w:r>
-        <w:rPr>
-          <w:rFonts w:ascii="Times New Roman" w:hAnsi="Times New Roman" w:cs="Times New Roman"/>
-          <w:sz w:val="24"/>
-          <w:szCs w:val="24"/>
-          <w:lang w:val="es-NI"/>
-        </w:rPr>
-        <w:t>Obligando a auditar y justificar cada partida desde su origen.</w:t>
-      </w:r>
-      <w:r>
-        <w:rPr>
-          <w:rFonts w:ascii="Times New Roman" w:hAnsi="Times New Roman" w:cs="Times New Roman"/>
-          <w:sz w:val="24"/>
-          <w:szCs w:val="24"/>
-          <w:lang w:val="es-NI"/>
-        </w:rPr>
-        <w:t xml:space="preserve"> </w:t>
-      </w:r>
-      <w:r>
-        <w:rPr>
-          <w:rFonts w:ascii="Times New Roman" w:hAnsi="Times New Roman" w:cs="Times New Roman"/>
-          <w:sz w:val="24"/>
-          <w:szCs w:val="24"/>
-          <w:lang w:val="es-NI"/>
-        </w:rPr>
-        <w:t>El linaje de datos</w:t>
-      </w:r>
-      <w:r>
-        <w:rPr>
-          <w:rFonts w:ascii="Times New Roman" w:hAnsi="Times New Roman" w:cs="Times New Roman"/>
-          <w:sz w:val="24"/>
-          <w:szCs w:val="24"/>
-          <w:lang w:val="es-NI"/>
-        </w:rPr>
-        <w:t xml:space="preserve">. </w:t>
-      </w:r>
-      <w:r>
-        <w:rPr>
-          <w:rFonts w:ascii="Times New Roman" w:hAnsi="Times New Roman" w:cs="Times New Roman"/>
-          <w:sz w:val="24"/>
-          <w:szCs w:val="24"/>
-          <w:lang w:val="es-NI"/>
-        </w:rPr>
-        <w:t>Garantizando una trazabilidad cronológica inalterable de cada transacción.</w:t>
-      </w:r>
-    </w:p>
-    <w:p>
-      <w:pPr>
-        <w:rPr>
-          <w:rFonts w:ascii="Times New Roman" w:hAnsi="Times New Roman" w:cs="Times New Roman"/>
-          <w:sz w:val="24"/>
-          <w:szCs w:val="24"/>
-          <w:lang w:val="es-NI"/>
-        </w:rPr>
-      </w:pPr>
-      <w:r>
-        <w:rPr>
-          <w:rFonts w:ascii="Times New Roman" w:hAnsi="Times New Roman" w:cs="Times New Roman"/>
+      </w:pPr>
+      <w:r>
+        <w:rPr>
+          <w:rFonts w:ascii="Times New Roman" w:hAnsi="Times New Roman" w:cs="Times New Roman"/>
+          <w:color w:val="000000" w:themeColor="text1"/>
           <w:sz w:val="24"/>
           <w:szCs w:val="24"/>
         </w:rPr>
@@ -1871,6 +2524,7 @@
       <w:pPr>
         <w:rPr>
           <w:rFonts w:ascii="Times New Roman" w:hAnsi="Times New Roman" w:cs="Times New Roman"/>
+          <w:color w:val="000000" w:themeColor="text1"/>
           <w:sz w:val="24"/>
           <w:szCs w:val="24"/>
           <w:lang w:val="es-NI"/>
@@ -1888,8 +2542,58 @@
 </w:document>
 </file>
 
+<file path=word/endnotes.xml><?xml version="1.0" encoding="utf-8"?>
+<w:endnotes xmlns:wpc="http://schemas.microsoft.com/office/word/2010/wordprocessingCanvas" xmlns:cx="http://schemas.microsoft.com/office/drawing/2014/chartex" xmlns:cx1="http://schemas.microsoft.com/office/drawing/2015/9/8/chartex" xmlns:cx2="http://schemas.microsoft.com/office/drawing/2015/10/21/chartex" xmlns:cx3="http://schemas.microsoft.com/office/drawing/2016/5/9/chartex" xmlns:cx4="http://schemas.microsoft.com/office/drawing/2016/5/10/chartex" xmlns:cx5="http://schemas.microsoft.com/office/drawing/2016/5/11/chartex" xmlns:cx6="http://schemas.microsoft.com/office/drawing/2016/5/12/chartex" xmlns:cx7="http://schemas.microsoft.com/office/drawing/2016/5/13/chartex" xmlns:cx8="http://schemas.microsoft.com/office/drawing/2016/5/14/chartex" xmlns:mc="http://schemas.openxmlformats.org/markup-compatibility/2006" xmlns:aink="http://schemas.microsoft.com/office/drawing/2016/ink" xmlns:am3d="http://schemas.microsoft.com/office/drawing/2017/model3d" xmlns:o="urn:schemas-microsoft-com:office:office" xmlns:oel="http://schemas.microsoft.com/office/2019/extlst" xmlns:r="http://schemas.openxmlformats.org/officeDocument/2006/relationships" xmlns:m="http://schemas.openxmlformats.org/officeDocument/2006/math" xmlns:v="urn:schemas-microsoft-com:vml" xmlns:wp14="http://schemas.microsoft.com/office/word/2010/wordprocessingDrawing" xmlns:wp="http://schemas.openxmlformats.org/drawingml/2006/wordprocessingDrawing" xmlns:w10="urn:schemas-microsoft-com:office:word" xmlns:w="http://schemas.openxmlformats.org/wordprocessingml/2006/main" xmlns:w14="http://schemas.microsoft.com/office/word/2010/wordml" xmlns:w15="http://schemas.microsoft.com/office/word/2012/wordml" xmlns:w16cex="http://schemas.microsoft.com/office/word/2018/wordml/cex" xmlns:w16cid="http://schemas.microsoft.com/office/word/2016/wordml/cid" xmlns:w16="http://schemas.microsoft.com/office/word/2018/wordml" xmlns:w16du="http://schemas.microsoft.com/office/word/2023/wordml/word16du" xmlns:w16sdtdh="http://schemas.microsoft.com/office/word/2020/wordml/sdtdatahash" xmlns:w16sdtfl="http://schemas.microsoft.com/office/word/2024/wordml/sdtformatlock" xmlns:w16se="http://schemas.microsoft.com/office/word/2015/wordml/symex" xmlns:wpg="http://schemas.microsoft.com/office/word/2010/wordprocessingGroup" xmlns:wpi="http://schemas.microsoft.com/office/word/2010/wordprocessingInk" xmlns:wne="http://schemas.microsoft.com/office/word/2006/wordml" xmlns:wps="http://schemas.microsoft.com/office/word/2010/wordprocessingShape" mc:Ignorable="w14 w15 w16se w16cid w16 w16cex w16sdtdh w16sdtfl w16du wp14">
+  <w:endnote w:type="separator" w:id="-1">
+    <w:p>
+      <w:pPr>
+        <w:spacing w:after="0" w:line="240" w:lineRule="auto"/>
+      </w:pPr>
+      <w:r>
+        <w:separator/>
+      </w:r>
+    </w:p>
+  </w:endnote>
+  <w:endnote w:type="continuationSeparator" w:id="0">
+    <w:p>
+      <w:pPr>
+        <w:spacing w:after="0" w:line="240" w:lineRule="auto"/>
+      </w:pPr>
+      <w:r>
+        <w:continuationSeparator/>
+      </w:r>
+    </w:p>
+  </w:endnote>
+</w:endnotes>
+</file>
+
+<file path=word/footnotes.xml><?xml version="1.0" encoding="utf-8"?>
+<w:footnotes xmlns:wpc="http://schemas.microsoft.com/office/word/2010/wordprocessingCanvas" xmlns:cx="http://schemas.microsoft.com/office/drawing/2014/chartex" xmlns:cx1="http://schemas.microsoft.com/office/drawing/2015/9/8/chartex" xmlns:cx2="http://schemas.microsoft.com/office/drawing/2015/10/21/chartex" xmlns:cx3="http://schemas.microsoft.com/office/drawing/2016/5/9/chartex" xmlns:cx4="http://schemas.microsoft.com/office/drawing/2016/5/10/chartex" xmlns:cx5="http://schemas.microsoft.com/office/drawing/2016/5/11/chartex" xmlns:cx6="http://schemas.microsoft.com/office/drawing/2016/5/12/chartex" xmlns:cx7="http://schemas.microsoft.com/office/drawing/2016/5/13/chartex" xmlns:cx8="http://schemas.microsoft.com/office/drawing/2016/5/14/chartex" xmlns:mc="http://schemas.openxmlformats.org/markup-compatibility/2006" xmlns:aink="http://schemas.microsoft.com/office/drawing/2016/ink" xmlns:am3d="http://schemas.microsoft.com/office/drawing/2017/model3d" xmlns:o="urn:schemas-microsoft-com:office:office" xmlns:oel="http://schemas.microsoft.com/office/2019/extlst" xmlns:r="http://schemas.openxmlformats.org/officeDocument/2006/relationships" xmlns:m="http://schemas.openxmlformats.org/officeDocument/2006/math" xmlns:v="urn:schemas-microsoft-com:vml" xmlns:wp14="http://schemas.microsoft.com/office/word/2010/wordprocessingDrawing" xmlns:wp="http://schemas.openxmlformats.org/drawingml/2006/wordprocessingDrawing" xmlns:w10="urn:schemas-microsoft-com:office:word" xmlns:w="http://schemas.openxmlformats.org/wordprocessingml/2006/main" xmlns:w14="http://schemas.microsoft.com/office/word/2010/wordml" xmlns:w15="http://schemas.microsoft.com/office/word/2012/wordml" xmlns:w16cex="http://schemas.microsoft.com/office/word/2018/wordml/cex" xmlns:w16cid="http://schemas.microsoft.com/office/word/2016/wordml/cid" xmlns:w16="http://schemas.microsoft.com/office/word/2018/wordml" xmlns:w16du="http://schemas.microsoft.com/office/word/2023/wordml/word16du" xmlns:w16sdtdh="http://schemas.microsoft.com/office/word/2020/wordml/sdtdatahash" xmlns:w16sdtfl="http://schemas.microsoft.com/office/word/2024/wordml/sdtformatlock" xmlns:w16se="http://schemas.microsoft.com/office/word/2015/wordml/symex" xmlns:wpg="http://schemas.microsoft.com/office/word/2010/wordprocessingGroup" xmlns:wpi="http://schemas.microsoft.com/office/word/2010/wordprocessingInk" xmlns:wne="http://schemas.microsoft.com/office/word/2006/wordml" xmlns:wps="http://schemas.microsoft.com/office/word/2010/wordprocessingShape" mc:Ignorable="w14 w15 w16se w16cid w16 w16cex w16sdtdh w16sdtfl w16du wp14">
+  <w:footnote w:type="separator" w:id="-1">
+    <w:p>
+      <w:pPr>
+        <w:spacing w:after="0" w:line="240" w:lineRule="auto"/>
+      </w:pPr>
+      <w:r>
+        <w:separator/>
+      </w:r>
+    </w:p>
+  </w:footnote>
+  <w:footnote w:type="continuationSeparator" w:id="0">
+    <w:p>
+      <w:pPr>
+        <w:spacing w:after="0" w:line="240" w:lineRule="auto"/>
+      </w:pPr>
+      <w:r>
+        <w:continuationSeparator/>
+      </w:r>
+    </w:p>
+  </w:footnote>
+</w:footnotes>
+</file>
+
 <file path=word/numbering.xml><?xml version="1.0" encoding="utf-8"?>
-<w:numbering xmlns:wpc="http://schemas.microsoft.com/office/word/2010/wordprocessingCanvas" xmlns:cx="http://schemas.microsoft.com/office/drawing/2014/chartex" xmlns:cx1="http://schemas.microsoft.com/office/drawing/2015/9/8/chartex" xmlns:cx2="http://schemas.microsoft.com/office/drawing/2015/10/21/chartex" xmlns:cx3="http://schemas.microsoft.com/office/drawing/2016/5/9/chartex" xmlns:cx4="http://schemas.microsoft.com/office/drawing/2016/5/10/chartex" xmlns:cx5="http://schemas.microsoft.com/office/drawing/2016/5/11/chartex" xmlns:cx6="http://schemas.microsoft.com/office/drawing/2016/5/12/chartex" xmlns:cx7="http://schemas.microsoft.com/office/drawing/2016/5/13/chartex" xmlns:cx8="http://schemas.microsoft.com/office/drawing/2016/5/14/chartex" xmlns:mc="http://schemas.openxmlformats.org/markup-compatibility/2006" xmlns:aink="http://schemas.microsoft.com/office/drawing/2016/ink" xmlns:am3d="http://schemas.microsoft.com/office/drawing/2017/model3d" xmlns:o="urn:schemas-microsoft-com:office:office" xmlns:oel="http://schemas.microsoft.com/office/2019/extlst" xmlns:r="http://schemas.openxmlformats.org/officeDocument/2006/relationships" xmlns:m="http://schemas.openxmlformats.org/officeDocument/2006/math" xmlns:v="urn:schemas-microsoft-com:vml" xmlns:wp14="http://schemas.microsoft.com/office/word/2010/wordprocessingDrawing" xmlns:wp="http://schemas.openxmlformats.org/drawingml/2006/wordprocessingDrawing" xmlns:w10="urn:schemas-microsoft-com:office:word" xmlns:w="http://schemas.openxmlformats.org/wordprocessingml/2006/main" xmlns:w14="http://schemas.microsoft.com/office/word/2010/wordml" xmlns:w15="http://schemas.microsoft.com/office/word/2012/wordml" xmlns:w16cex="http://schemas.microsoft.com/office/word/2018/wordml/cex" xmlns:w16cid="http://schemas.microsoft.com/office/word/2016/wordml/cid" xmlns:w16="http://schemas.microsoft.com/office/word/2018/wordml" xmlns:w16sdtdh="http://schemas.microsoft.com/office/word/2020/wordml/sdtdatahash" xmlns:w16se="http://schemas.microsoft.com/office/word/2015/wordml/symex" xmlns:wpg="http://schemas.microsoft.com/office/word/2010/wordprocessingGroup" xmlns:wpi="http://schemas.microsoft.com/office/word/2010/wordprocessingInk" xmlns:wne="http://schemas.microsoft.com/office/word/2006/wordml" xmlns:wps="http://schemas.microsoft.com/office/word/2010/wordprocessingShape" mc:Ignorable="w14 w15 w16se w16cid w16 w16cex w16sdtdh wp14">
+<w:numbering xmlns:wpc="http://schemas.microsoft.com/office/word/2010/wordprocessingCanvas" xmlns:cx="http://schemas.microsoft.com/office/drawing/2014/chartex" xmlns:cx1="http://schemas.microsoft.com/office/drawing/2015/9/8/chartex" xmlns:cx2="http://schemas.microsoft.com/office/drawing/2015/10/21/chartex" xmlns:cx3="http://schemas.microsoft.com/office/drawing/2016/5/9/chartex" xmlns:cx4="http://schemas.microsoft.com/office/drawing/2016/5/10/chartex" xmlns:cx5="http://schemas.microsoft.com/office/drawing/2016/5/11/chartex" xmlns:cx6="http://schemas.microsoft.com/office/drawing/2016/5/12/chartex" xmlns:cx7="http://schemas.microsoft.com/office/drawing/2016/5/13/chartex" xmlns:cx8="http://schemas.microsoft.com/office/drawing/2016/5/14/chartex" xmlns:mc="http://schemas.openxmlformats.org/markup-compatibility/2006" xmlns:aink="http://schemas.microsoft.com/office/drawing/2016/ink" xmlns:am3d="http://schemas.microsoft.com/office/drawing/2017/model3d" xmlns:o="urn:schemas-microsoft-com:office:office" xmlns:oel="http://schemas.microsoft.com/office/2019/extlst" xmlns:r="http://schemas.openxmlformats.org/officeDocument/2006/relationships" xmlns:m="http://schemas.openxmlformats.org/officeDocument/2006/math" xmlns:v="urn:schemas-microsoft-com:vml" xmlns:wp14="http://schemas.microsoft.com/office/word/2010/wordprocessingDrawing" xmlns:wp="http://schemas.openxmlformats.org/drawingml/2006/wordprocessingDrawing" xmlns:w10="urn:schemas-microsoft-com:office:word" xmlns:w="http://schemas.openxmlformats.org/wordprocessingml/2006/main" xmlns:w14="http://schemas.microsoft.com/office/word/2010/wordml" xmlns:w15="http://schemas.microsoft.com/office/word/2012/wordml" xmlns:w16cex="http://schemas.microsoft.com/office/word/2018/wordml/cex" xmlns:w16cid="http://schemas.microsoft.com/office/word/2016/wordml/cid" xmlns:w16="http://schemas.microsoft.com/office/word/2018/wordml" xmlns:w16du="http://schemas.microsoft.com/office/word/2023/wordml/word16du" xmlns:w16sdtdh="http://schemas.microsoft.com/office/word/2020/wordml/sdtdatahash" xmlns:w16sdtfl="http://schemas.microsoft.com/office/word/2024/wordml/sdtformatlock" xmlns:w16se="http://schemas.microsoft.com/office/word/2015/wordml/symex" xmlns:wpg="http://schemas.microsoft.com/office/word/2010/wordprocessingGroup" xmlns:wpi="http://schemas.microsoft.com/office/word/2010/wordprocessingInk" xmlns:wne="http://schemas.microsoft.com/office/word/2006/wordml" xmlns:wps="http://schemas.microsoft.com/office/word/2010/wordprocessingShape" mc:Ignorable="w14 w15 w16se w16cid w16 w16cex w16sdtdh w16sdtfl w16du wp14">
   <w:abstractNum w:abstractNumId="0" w15:restartNumberingAfterBreak="0">
     <w:nsid w:val="0B770EAE"/>
     <w:multiLevelType w:val="hybridMultilevel"/>
@@ -1980,6 +2684,119 @@
     </w:lvl>
   </w:abstractNum>
   <w:abstractNum w:abstractNumId="1" w15:restartNumberingAfterBreak="0">
+    <w:nsid w:val="0E074FDC"/>
+    <w:multiLevelType w:val="hybridMultilevel"/>
+    <w:tmpl w:val="CA941482"/>
+    <w:lvl w:ilvl="0" w:tplc="0C0A0009">
+      <w:start w:val="1"/>
+      <w:numFmt w:val="bullet"/>
+      <w:lvlText w:val=""/>
+      <w:lvlJc w:val="left"/>
+      <w:pPr>
+        <w:ind w:left="1440" w:hanging="360"/>
+      </w:pPr>
+      <w:rPr>
+        <w:rFonts w:ascii="Wingdings" w:hAnsi="Wingdings" w:hint="default"/>
+      </w:rPr>
+    </w:lvl>
+    <w:lvl w:ilvl="1" w:tplc="0C0A0003" w:tentative="1">
+      <w:start w:val="1"/>
+      <w:numFmt w:val="bullet"/>
+      <w:lvlText w:val="o"/>
+      <w:lvlJc w:val="left"/>
+      <w:pPr>
+        <w:ind w:left="2160" w:hanging="360"/>
+      </w:pPr>
+      <w:rPr>
+        <w:rFonts w:ascii="Courier New" w:hAnsi="Courier New" w:cs="Courier New" w:hint="default"/>
+      </w:rPr>
+    </w:lvl>
+    <w:lvl w:ilvl="2" w:tplc="0C0A0005" w:tentative="1">
+      <w:start w:val="1"/>
+      <w:numFmt w:val="bullet"/>
+      <w:lvlText w:val=""/>
+      <w:lvlJc w:val="left"/>
+      <w:pPr>
+        <w:ind w:left="2880" w:hanging="360"/>
+      </w:pPr>
+      <w:rPr>
+        <w:rFonts w:ascii="Wingdings" w:hAnsi="Wingdings" w:hint="default"/>
+      </w:rPr>
+    </w:lvl>
+    <w:lvl w:ilvl="3" w:tplc="0C0A0001" w:tentative="1">
+      <w:start w:val="1"/>
+      <w:numFmt w:val="bullet"/>
+      <w:lvlText w:val=""/>
+      <w:lvlJc w:val="left"/>
+      <w:pPr>
+        <w:ind w:left="3600" w:hanging="360"/>
+      </w:pPr>
+      <w:rPr>
+        <w:rFonts w:ascii="Symbol" w:hAnsi="Symbol" w:hint="default"/>
+      </w:rPr>
+    </w:lvl>
+    <w:lvl w:ilvl="4" w:tplc="0C0A0003" w:tentative="1">
+      <w:start w:val="1"/>
+      <w:numFmt w:val="bullet"/>
+      <w:lvlText w:val="o"/>
+      <w:lvlJc w:val="left"/>
+      <w:pPr>
+        <w:ind w:left="4320" w:hanging="360"/>
+      </w:pPr>
+      <w:rPr>
+        <w:rFonts w:ascii="Courier New" w:hAnsi="Courier New" w:cs="Courier New" w:hint="default"/>
+      </w:rPr>
+    </w:lvl>
+    <w:lvl w:ilvl="5" w:tplc="0C0A0005" w:tentative="1">
+      <w:start w:val="1"/>
+      <w:numFmt w:val="bullet"/>
+      <w:lvlText w:val=""/>
+      <w:lvlJc w:val="left"/>
+      <w:pPr>
+        <w:ind w:left="5040" w:hanging="360"/>
+      </w:pPr>
+      <w:rPr>
+        <w:rFonts w:ascii="Wingdings" w:hAnsi="Wingdings" w:hint="default"/>
+      </w:rPr>
+    </w:lvl>
+    <w:lvl w:ilvl="6" w:tplc="0C0A0001" w:tentative="1">
+      <w:start w:val="1"/>
+      <w:numFmt w:val="bullet"/>
+      <w:lvlText w:val=""/>
+      <w:lvlJc w:val="left"/>
+      <w:pPr>
+        <w:ind w:left="5760" w:hanging="360"/>
+      </w:pPr>
+      <w:rPr>
+        <w:rFonts w:ascii="Symbol" w:hAnsi="Symbol" w:hint="default"/>
+      </w:rPr>
+    </w:lvl>
+    <w:lvl w:ilvl="7" w:tplc="0C0A0003" w:tentative="1">
+      <w:start w:val="1"/>
+      <w:numFmt w:val="bullet"/>
+      <w:lvlText w:val="o"/>
+      <w:lvlJc w:val="left"/>
+      <w:pPr>
+        <w:ind w:left="6480" w:hanging="360"/>
+      </w:pPr>
+      <w:rPr>
+        <w:rFonts w:ascii="Courier New" w:hAnsi="Courier New" w:cs="Courier New" w:hint="default"/>
+      </w:rPr>
+    </w:lvl>
+    <w:lvl w:ilvl="8" w:tplc="0C0A0005" w:tentative="1">
+      <w:start w:val="1"/>
+      <w:numFmt w:val="bullet"/>
+      <w:lvlText w:val=""/>
+      <w:lvlJc w:val="left"/>
+      <w:pPr>
+        <w:ind w:left="7200" w:hanging="360"/>
+      </w:pPr>
+      <w:rPr>
+        <w:rFonts w:ascii="Wingdings" w:hAnsi="Wingdings" w:hint="default"/>
+      </w:rPr>
+    </w:lvl>
+  </w:abstractNum>
+  <w:abstractNum w:abstractNumId="2" w15:restartNumberingAfterBreak="0">
     <w:nsid w:val="0FC06BD9"/>
     <w:multiLevelType w:val="hybridMultilevel"/>
     <w:tmpl w:val="7420838E"/>
@@ -2065,7 +2882,7 @@
       </w:pPr>
     </w:lvl>
   </w:abstractNum>
-  <w:abstractNum w:abstractNumId="2" w15:restartNumberingAfterBreak="0">
+  <w:abstractNum w:abstractNumId="3" w15:restartNumberingAfterBreak="0">
     <w:nsid w:val="36FA53B6"/>
     <w:multiLevelType w:val="hybridMultilevel"/>
     <w:tmpl w:val="5B926C34"/>
@@ -2151,7 +2968,7 @@
       </w:pPr>
     </w:lvl>
   </w:abstractNum>
-  <w:abstractNum w:abstractNumId="3" w15:restartNumberingAfterBreak="0">
+  <w:abstractNum w:abstractNumId="4" w15:restartNumberingAfterBreak="0">
     <w:nsid w:val="74650CDE"/>
     <w:multiLevelType w:val="multilevel"/>
     <w:tmpl w:val="A0BAA488"/>
@@ -2304,19 +3121,22 @@
     <w:abstractNumId w:val="0"/>
   </w:num>
   <w:num w:numId="2" w16cid:durableId="991786523">
+    <w:abstractNumId w:val="3"/>
+  </w:num>
+  <w:num w:numId="3" w16cid:durableId="914363217">
+    <w:abstractNumId w:val="4"/>
+  </w:num>
+  <w:num w:numId="4" w16cid:durableId="83231884">
     <w:abstractNumId w:val="2"/>
   </w:num>
-  <w:num w:numId="3" w16cid:durableId="914363217">
-    <w:abstractNumId w:val="3"/>
-  </w:num>
-  <w:num w:numId="4" w16cid:durableId="83231884">
+  <w:num w:numId="5" w16cid:durableId="1900942283">
     <w:abstractNumId w:val="1"/>
   </w:num>
 </w:numbering>
 </file>
 
 <file path=word/styles.xml><?xml version="1.0" encoding="utf-8"?>
-<w:styles xmlns:mc="http://schemas.openxmlformats.org/markup-compatibility/2006" xmlns:r="http://schemas.openxmlformats.org/officeDocument/2006/relationships" xmlns:w="http://schemas.openxmlformats.org/wordprocessingml/2006/main" xmlns:w14="http://schemas.microsoft.com/office/word/2010/wordml" xmlns:w15="http://schemas.microsoft.com/office/word/2012/wordml" xmlns:w16cex="http://schemas.microsoft.com/office/word/2018/wordml/cex" xmlns:w16cid="http://schemas.microsoft.com/office/word/2016/wordml/cid" xmlns:w16="http://schemas.microsoft.com/office/word/2018/wordml" xmlns:w16sdtdh="http://schemas.microsoft.com/office/word/2020/wordml/sdtdatahash" xmlns:w16se="http://schemas.microsoft.com/office/word/2015/wordml/symex" mc:Ignorable="w14 w15 w16se w16cid w16 w16cex w16sdtdh">
+<w:styles xmlns:mc="http://schemas.openxmlformats.org/markup-compatibility/2006" xmlns:r="http://schemas.openxmlformats.org/officeDocument/2006/relationships" xmlns:w="http://schemas.openxmlformats.org/wordprocessingml/2006/main" xmlns:w14="http://schemas.microsoft.com/office/word/2010/wordml" xmlns:w15="http://schemas.microsoft.com/office/word/2012/wordml" xmlns:w16cex="http://schemas.microsoft.com/office/word/2018/wordml/cex" xmlns:w16cid="http://schemas.microsoft.com/office/word/2016/wordml/cid" xmlns:w16="http://schemas.microsoft.com/office/word/2018/wordml" xmlns:w16du="http://schemas.microsoft.com/office/word/2023/wordml/word16du" xmlns:w16sdtdh="http://schemas.microsoft.com/office/word/2020/wordml/sdtdatahash" xmlns:w16sdtfl="http://schemas.microsoft.com/office/word/2024/wordml/sdtformatlock" xmlns:w16se="http://schemas.microsoft.com/office/word/2015/wordml/symex" mc:Ignorable="w14 w15 w16se w16cid w16 w16cex w16sdtdh w16sdtfl w16du">
   <w:docDefaults>
     <w:rPrDefault>
       <w:rPr>
@@ -2746,7 +3566,6 @@
     <w:next w:val="Normal"/>
     <w:link w:val="Ttulo2Car"/>
     <w:uiPriority w:val="9"/>
-    <w:semiHidden/>
     <w:unhideWhenUsed/>
     <w:qFormat/>
     <w:rsid w:val="00B67B8E"/>
@@ -2921,6 +3740,7 @@
   <w:style w:type="character" w:default="1" w:styleId="Fuentedeprrafopredeter">
     <w:name w:val="Default Paragraph Font"/>
     <w:uiPriority w:val="1"/>
+    <w:semiHidden/>
     <w:unhideWhenUsed/>
   </w:style>
   <w:style w:type="table" w:default="1" w:styleId="Tablanormal">
@@ -2963,7 +3783,6 @@
     <w:basedOn w:val="Fuentedeprrafopredeter"/>
     <w:link w:val="Ttulo2"/>
     <w:uiPriority w:val="9"/>
-    <w:semiHidden/>
     <w:rsid w:val="00B67B8E"/>
     <w:rPr>
       <w:rFonts w:asciiTheme="majorHAnsi" w:eastAsiaTheme="majorEastAsia" w:hAnsiTheme="majorHAnsi" w:cstheme="majorBidi"/>
@@ -3270,6 +4089,101 @@
       <w:shd w:val="clear" w:color="auto" w:fill="E1DFDD"/>
     </w:rPr>
   </w:style>
+  <w:style w:type="paragraph" w:styleId="TtuloTDC">
+    <w:name w:val="TOC Heading"/>
+    <w:basedOn w:val="Ttulo1"/>
+    <w:next w:val="Normal"/>
+    <w:uiPriority w:val="39"/>
+    <w:unhideWhenUsed/>
+    <w:qFormat/>
+    <w:rsid w:val="002A1C11"/>
+    <w:pPr>
+      <w:spacing w:before="240" w:after="0"/>
+      <w:outlineLvl w:val="9"/>
+    </w:pPr>
+    <w:rPr>
+      <w:kern w:val="0"/>
+      <w:sz w:val="32"/>
+      <w:szCs w:val="32"/>
+      <w:lang w:val="es-ES" w:eastAsia="es-ES"/>
+      <w14:ligatures w14:val="none"/>
+    </w:rPr>
+  </w:style>
+  <w:style w:type="paragraph" w:styleId="TDC1">
+    <w:name w:val="toc 1"/>
+    <w:basedOn w:val="Normal"/>
+    <w:next w:val="Normal"/>
+    <w:autoRedefine/>
+    <w:uiPriority w:val="39"/>
+    <w:unhideWhenUsed/>
+    <w:rsid w:val="002A1C11"/>
+    <w:pPr>
+      <w:spacing w:after="100"/>
+    </w:pPr>
+  </w:style>
+  <w:style w:type="paragraph" w:styleId="TDC2">
+    <w:name w:val="toc 2"/>
+    <w:basedOn w:val="Normal"/>
+    <w:next w:val="Normal"/>
+    <w:autoRedefine/>
+    <w:uiPriority w:val="39"/>
+    <w:unhideWhenUsed/>
+    <w:rsid w:val="002A1C11"/>
+    <w:pPr>
+      <w:spacing w:after="100"/>
+      <w:ind w:left="220"/>
+    </w:pPr>
+  </w:style>
+  <w:style w:type="paragraph" w:styleId="Encabezado">
+    <w:name w:val="header"/>
+    <w:basedOn w:val="Normal"/>
+    <w:link w:val="EncabezadoCar"/>
+    <w:uiPriority w:val="99"/>
+    <w:unhideWhenUsed/>
+    <w:rsid w:val="0071782B"/>
+    <w:pPr>
+      <w:tabs>
+        <w:tab w:val="center" w:pos="4252"/>
+        <w:tab w:val="right" w:pos="8504"/>
+      </w:tabs>
+      <w:spacing w:after="0" w:line="240" w:lineRule="auto"/>
+    </w:pPr>
+  </w:style>
+  <w:style w:type="character" w:customStyle="1" w:styleId="EncabezadoCar">
+    <w:name w:val="Encabezado Car"/>
+    <w:basedOn w:val="Fuentedeprrafopredeter"/>
+    <w:link w:val="Encabezado"/>
+    <w:uiPriority w:val="99"/>
+    <w:rsid w:val="0071782B"/>
+    <w:rPr>
+      <w:lang w:val="es-419"/>
+    </w:rPr>
+  </w:style>
+  <w:style w:type="paragraph" w:styleId="Piedepgina">
+    <w:name w:val="footer"/>
+    <w:basedOn w:val="Normal"/>
+    <w:link w:val="PiedepginaCar"/>
+    <w:uiPriority w:val="99"/>
+    <w:unhideWhenUsed/>
+    <w:rsid w:val="0071782B"/>
+    <w:pPr>
+      <w:tabs>
+        <w:tab w:val="center" w:pos="4252"/>
+        <w:tab w:val="right" w:pos="8504"/>
+      </w:tabs>
+      <w:spacing w:after="0" w:line="240" w:lineRule="auto"/>
+    </w:pPr>
+  </w:style>
+  <w:style w:type="character" w:customStyle="1" w:styleId="PiedepginaCar">
+    <w:name w:val="Pie de página Car"/>
+    <w:basedOn w:val="Fuentedeprrafopredeter"/>
+    <w:link w:val="Piedepgina"/>
+    <w:uiPriority w:val="99"/>
+    <w:rsid w:val="0071782B"/>
+    <w:rPr>
+      <w:lang w:val="es-419"/>
+    </w:rPr>
+  </w:style>
 </w:styles>
 </file>
 
@@ -3566,4 +4480,16 @@
     </a:ext>
   </a:extLst>
 </a:theme>
+</file>
+
+<file path=customXml/item1.xml><?xml version="1.0" encoding="utf-8"?>
+<b:Sources xmlns:b="http://schemas.openxmlformats.org/officeDocument/2006/bibliography" xmlns="http://schemas.openxmlformats.org/officeDocument/2006/bibliography" SelectedStyle="\APASixthEditionOfficeOnline.xsl" StyleName="APA" Version="6"/>
+</file>
+
+<file path=customXml/itemProps1.xml><?xml version="1.0" encoding="utf-8"?>
+<ds:datastoreItem xmlns:ds="http://schemas.openxmlformats.org/officeDocument/2006/customXml" ds:itemID="{89FEC538-86A9-4A0B-9926-405F723CDBAE}">
+  <ds:schemaRefs>
+    <ds:schemaRef ds:uri="http://schemas.openxmlformats.org/officeDocument/2006/bibliography"/>
+  </ds:schemaRefs>
+</ds:datastoreItem>
 </file>
</xml_diff>